<commit_message>
feat: add admin product/stats pages and update report 2026-04-10 to 2026-04-13
</commit_message>
<xml_diff>
--- a/docs/BAO_CAO_TONG_HOP.docx
+++ b/docs/BAO_CAO_TONG_HOP.docx
@@ -1,6 +1,6 @@
 
 <file path=word/document.xml><?xml version="1.0" encoding="utf-8"?>
-<w:document xmlns:wpc="http://schemas.microsoft.com/office/word/2010/wordprocessingCanvas" xmlns:mo="http://schemas.microsoft.com/office/mac/office/2008/main" xmlns:mc="http://schemas.openxmlformats.org/markup-compatibility/2006" xmlns:mv="urn:schemas-microsoft-com:mac:vml" xmlns:o="urn:schemas-microsoft-com:office:office" xmlns:r="http://schemas.openxmlformats.org/officeDocument/2006/relationships" xmlns:m="http://schemas.openxmlformats.org/officeDocument/2006/math" xmlns:v="urn:schemas-microsoft-com:vml" xmlns:wp14="http://schemas.microsoft.com/office/word/2010/wordprocessingDrawing" xmlns:wp="http://schemas.openxmlformats.org/drawingml/2006/wordprocessingDrawing" xmlns:w10="urn:schemas-microsoft-com:office:word" xmlns:w="http://schemas.openxmlformats.org/wordprocessingml/2006/main" xmlns:w14="http://schemas.microsoft.com/office/word/2010/wordml" xmlns:wpg="http://schemas.microsoft.com/office/word/2010/wordprocessingGroup" xmlns:wpi="http://schemas.microsoft.com/office/word/2010/wordprocessingInk" xmlns:wne="http://schemas.microsoft.com/office/word/2006/wordml" xmlns:wps="http://schemas.microsoft.com/office/word/2010/wordprocessingShape" mc:Ignorable="w14 wp14">
+<w:document xmlns:ns1="http://schemas.openxmlformats.org/markup-compatibility/2006" xmlns:w="http://schemas.openxmlformats.org/wordprocessingml/2006/main" ns1:Ignorable="w14 wp14">
   <w:body>
     <w:p>
       <w:pPr>
@@ -571,6 +571,297 @@
         <w:t>Hoan thien tai lieu huong dan su dung cho admin va nguoi dung.</w:t>
       </w:r>
     </w:p>
+    <w:p>
+      <w:r>
+        <w:t>Bao cao bo sung 3: CAP_NHAT_MODEL_2026-04-09</w:t>
+      </w:r>
+    </w:p>
+    <w:p>
+      <w:r>
+        <w:t>BAO CAO CAP NHAT MODEL NGAY 09/04/2026</w:t>
+      </w:r>
+    </w:p>
+    <w:p>
+      <w:r>
+        <w:t>Du an: Quan ly ban hang</w:t>
+      </w:r>
+    </w:p>
+    <w:p>
+      <w:r>
+        <w:t>Ngay cap nhat: 09/04/2026</w:t>
+      </w:r>
+    </w:p>
+    <w:p>
+      <w:r>
+        <w:t>1. Muc tieu cap nhat</w:t>
+      </w:r>
+    </w:p>
+    <w:p>
+      <w:r>
+        <w:t>Hoan thien model nghiep vu cho app orders va app products de san sang cho cac buoc view/service checkout.</w:t>
+      </w:r>
+    </w:p>
+    <w:p>
+      <w:r>
+        <w:t>2. Noi dung da thuc hien</w:t>
+      </w:r>
+    </w:p>
+    <w:p>
+      <w:r>
+        <w:t>Orders: bo sung helper tinh tong tien don hang (recalculate_totals), tu dong tinh discount/sub_total cho OrderDetail, validate du lieu dau vao va them __str__/ordering.</w:t>
+      </w:r>
+    </w:p>
+    <w:p>
+      <w:r>
+        <w:t>Orders: chuan hoa thong bao loi ValidationError bang tieng Viet (khong dau) va them ghi chu tai cac doan code moi.</w:t>
+      </w:r>
+    </w:p>
+    <w:p>
+      <w:r>
+        <w:t>Products: bo sung helper gia sau giam (discounted_price), dinh dang gia hien thi (formatted_price), validate gia/ton kho/ty le giam gia.</w:t>
+      </w:r>
+    </w:p>
+    <w:p>
+      <w:r>
+        <w:t>Products: bo sung tinh toan tu dong cho CartItem (discount_amount, sub_total), helper tong hop Cart (total_items, total_amount), va xu ly hop le cho DiscountCode (is_valid, mark_as_used).</w:t>
+      </w:r>
+    </w:p>
+    <w:p>
+      <w:r>
+        <w:t>3. Ket qua kiem thu</w:t>
+      </w:r>
+    </w:p>
+    <w:p>
+      <w:r>
+        <w:t>python manage.py test orders: 7/7 test pass.</w:t>
+      </w:r>
+    </w:p>
+    <w:p>
+      <w:r>
+        <w:t>python manage.py test products: 9/9 test pass.</w:t>
+      </w:r>
+    </w:p>
+    <w:p>
+      <w:r>
+        <w:t>python manage.py test: 29/29 test pass.</w:t>
+      </w:r>
+    </w:p>
+    <w:p>
+      <w:r>
+        <w:t>4. File thay doi chinh</w:t>
+      </w:r>
+    </w:p>
+    <w:p>
+      <w:r>
+        <w:t>orders/models.py</w:t>
+      </w:r>
+    </w:p>
+    <w:p>
+      <w:r>
+        <w:t>orders/tests.py</w:t>
+      </w:r>
+    </w:p>
+    <w:p>
+      <w:r>
+        <w:t>products/models.py</w:t>
+      </w:r>
+    </w:p>
+    <w:p>
+      <w:r>
+        <w:t>products/tests.py</w:t>
+      </w:r>
+    </w:p>
+    <w:p>
+      <w:r>
+        <w:t>5. Ghi chu</w:t>
+      </w:r>
+    </w:p>
+    <w:p>
+      <w:r>
+        <w:t>Chua mo rong sang views/forms/API trong lan cap nhat nay; tam thoi tap trung vao data model, validation va tinh toan nghiep vu co ban.</w:t>
+      </w:r>
+    </w:p>
+    <w:p/>
+    <w:p>
+      <w:r>
+        <w:t>Bao cao bo sung 4: CAP_NHAT_2026-04-10_DEN_2026-04-13</w:t>
+      </w:r>
+    </w:p>
+    <w:p>
+      <w:r>
+        <w:t>BAO CAO CAP NHAT TU NGAY 10/04/2026 DEN 13/04/2026</w:t>
+      </w:r>
+    </w:p>
+    <w:p>
+      <w:r>
+        <w:t>Du an: Quan ly ban hang</w:t>
+      </w:r>
+    </w:p>
+    <w:p>
+      <w:r>
+        <w:t>Khoang thoi gian: 10/04/2026 - 13/04/2026</w:t>
+      </w:r>
+    </w:p>
+    <w:p/>
+    <w:p>
+      <w:r>
+        <w:t>1. Muc tieu cap nhat</w:t>
+      </w:r>
+    </w:p>
+    <w:p>
+      <w:r>
+        <w:t>Dong bo giao dien Home, Product Detail va cac trang Admin.</w:t>
+      </w:r>
+    </w:p>
+    <w:p>
+      <w:r>
+        <w:t>Bo sung phan quyen menu theo vai tro admin/customer.</w:t>
+      </w:r>
+    </w:p>
+    <w:p>
+      <w:r>
+        <w:t>Tao trang Admin them san pham va trang thong ke ban hang su dung truy van SQL.</w:t>
+      </w:r>
+    </w:p>
+    <w:p>
+      <w:r>
+        <w:t>Chuan bi cau truc mo rong bo loc/danh muc san pham tren trang chu.</w:t>
+      </w:r>
+    </w:p>
+    <w:p/>
+    <w:p>
+      <w:r>
+        <w:t>2. Noi dung da thuc hien</w:t>
+      </w:r>
+    </w:p>
+    <w:p>
+      <w:r>
+        <w:t>Khoi phuc aside Phan loai + Bo loc tren Home, render dong tu backend context de de mo rong.</w:t>
+      </w:r>
+    </w:p>
+    <w:p>
+      <w:r>
+        <w:t>Tao trang admin_product_create.html voi form: the loai, hinh anh chinh, toi da 6 anh phu, so luong, gia, ten, mo ta va preview anh.</w:t>
+      </w:r>
+    </w:p>
+    <w:p>
+      <w:r>
+        <w:t>Tao trang admin_sales_stats.html hien thi thong ke: so nguoi dang ky, so don ban ra, doanh thu, tong san pham.</w:t>
+      </w:r>
+    </w:p>
+    <w:p>
+      <w:r>
+        <w:t>Them route /admin/thong-ke-ban-hang/ chi cho admin va lay so lieu bang SQL file dashboard_stats.sql.</w:t>
+      </w:r>
+    </w:p>
+    <w:p>
+      <w:r>
+        <w:t>Cap nhat menu: chi admin thay Them san pham + Thong ke ban hang; chi customer thay Vi tien + Gio hang.</w:t>
+      </w:r>
+    </w:p>
+    <w:p>
+      <w:r>
+        <w:t>Cap nhat route san-pham/preview va san-pham/&lt;id&gt;, dong bo giao dien product_detail voi home.</w:t>
+      </w:r>
+    </w:p>
+    <w:p>
+      <w:r>
+        <w:t>Don dep du lieu mau/hardcode trong cac template va views de san sang noi du lieu that.</w:t>
+      </w:r>
+    </w:p>
+    <w:p/>
+    <w:p>
+      <w:r>
+        <w:t>3. File thay doi chinh</w:t>
+      </w:r>
+    </w:p>
+    <w:p>
+      <w:r>
+        <w:t>banhang/urls.py</w:t>
+      </w:r>
+    </w:p>
+    <w:p>
+      <w:r>
+        <w:t>templates/home.html</w:t>
+      </w:r>
+    </w:p>
+    <w:p>
+      <w:r>
+        <w:t>templates/product_detail.html</w:t>
+      </w:r>
+    </w:p>
+    <w:p>
+      <w:r>
+        <w:t>templates/admin_product_create.html</w:t>
+      </w:r>
+    </w:p>
+    <w:p>
+      <w:r>
+        <w:t>templates/admin_sales_stats.html</w:t>
+      </w:r>
+    </w:p>
+    <w:p>
+      <w:r>
+        <w:t>products/views.py</w:t>
+      </w:r>
+    </w:p>
+    <w:p>
+      <w:r>
+        <w:t>products/urls.py</w:t>
+      </w:r>
+    </w:p>
+    <w:p>
+      <w:r>
+        <w:t>static/css/home.css</w:t>
+      </w:r>
+    </w:p>
+    <w:p/>
+    <w:p>
+      <w:r>
+        <w:t>4. Ket qua kiem tra</w:t>
+      </w:r>
+    </w:p>
+    <w:p>
+      <w:r>
+        <w:t>python manage.py check: pass.</w:t>
+      </w:r>
+    </w:p>
+    <w:p>
+      <w:r>
+        <w:t>Route admin them san pham truy cap duoc: /san-pham/admin/them-san-pham/.</w:t>
+      </w:r>
+    </w:p>
+    <w:p>
+      <w:r>
+        <w:t>Route thong ke ban hang truy cap duoc voi admin: /admin/thong-ke-ban-hang/; user thuong bi chan.</w:t>
+      </w:r>
+    </w:p>
+    <w:p>
+      <w:r>
+        <w:t>Phan quyen menu theo role hoat dong dung tren home/product_detail/admin.</w:t>
+      </w:r>
+    </w:p>
+    <w:p/>
+    <w:p>
+      <w:r>
+        <w:t>5. Ke hoach tiep theo</w:t>
+      </w:r>
+    </w:p>
+    <w:p>
+      <w:r>
+        <w:t>Xu ly POST de luu form them san pham vao CSDL (kem upload media).</w:t>
+      </w:r>
+    </w:p>
+    <w:p>
+      <w:r>
+        <w:t>Hoan thien truy van danh sach san pham + phan trang 12 san pham/trang theo thu tu admin.</w:t>
+      </w:r>
+    </w:p>
+    <w:p>
+      <w:r>
+        <w:t>Bo sung bieu do doanh thu va top san pham ban chay cho trang thong ke.</w:t>
+      </w:r>
+    </w:p>
     <w:sectPr>
       <w:pgSz w:w="12240" w:h="15840"/>
       <w:pgMar w:top="1440" w:right="1800" w:bottom="1440" w:left="1800" w:header="720" w:footer="720" w:gutter="0"/>

</xml_diff>

<commit_message>
docs: cap nhat bao cao tong hop ngay 2026-04-14
</commit_message>
<xml_diff>
--- a/docs/BAO_CAO_TONG_HOP.docx
+++ b/docs/BAO_CAO_TONG_HOP.docx
@@ -862,6 +862,247 @@
         <w:t>Bo sung bieu do doanh thu va top san pham ban chay cho trang thong ke.</w:t>
       </w:r>
     </w:p>
+    <w:p/>
+    <w:p>
+      <w:r>
+        <w:t>Bao cao bo sung 5: CAP_NHAT_2026-04-14</w:t>
+      </w:r>
+    </w:p>
+    <w:p>
+      <w:r>
+        <w:t>BAO CAO CAP NHAT NGAY 14/04/2026</w:t>
+      </w:r>
+    </w:p>
+    <w:p>
+      <w:r>
+        <w:t>Du an: Quan ly ban hang</w:t>
+      </w:r>
+    </w:p>
+    <w:p>
+      <w:r>
+        <w:t>Ngay cap nhat: 14/04/2026</w:t>
+      </w:r>
+    </w:p>
+    <w:p/>
+    <w:p>
+      <w:r>
+        <w:t>1. Muc tieu cap nhat</w:t>
+      </w:r>
+    </w:p>
+    <w:p>
+      <w:r>
+        <w:t>Hoan thien luong yeu cau nap tien giua customer va admin.</w:t>
+      </w:r>
+    </w:p>
+    <w:p>
+      <w:r>
+        <w:t>Bo sung giao dien thong ke ban hang cho admin va cap nhat menu theo phan quyen role.</w:t>
+      </w:r>
+    </w:p>
+    <w:p/>
+    <w:p>
+      <w:r>
+        <w:t>2. Noi dung da thuc hien</w:t>
+      </w:r>
+    </w:p>
+    <w:p>
+      <w:r>
+        <w:t>Tao trang topup_request.html cho customer gui yeu cau nap tien gom so tien (VND) va ly do nap.</w:t>
+      </w:r>
+    </w:p>
+    <w:p>
+      <w:r>
+        <w:t>Tao trang topup_admin_review.html cho admin xu ly yeu cau nap tien voi 2 hanh dong: chap nhan hoac tu choi.</w:t>
+      </w:r>
+    </w:p>
+    <w:p>
+      <w:r>
+        <w:t>Cap nhat backend xu ly nghiep vu nap tien: tao request, doi trang thai request, cong so du vi khi chap nhan.</w:t>
+      </w:r>
+    </w:p>
+    <w:p>
+      <w:r>
+        <w:t>Bo sung route: /nap-tien/ va /admin/duyet-nap-tien/.</w:t>
+      </w:r>
+    </w:p>
+    <w:p>
+      <w:r>
+        <w:t>Cap nhat menu home/product_detail/admin pages de dieu huong dung theo role (admin/customer).</w:t>
+      </w:r>
+    </w:p>
+    <w:p>
+      <w:r>
+        <w:t>Them trang admin_sales_stats va cau hinh truy van SQL rieng admin_sales_stats.sql.</w:t>
+      </w:r>
+    </w:p>
+    <w:p/>
+    <w:p>
+      <w:r>
+        <w:t>3. Ket qua dat duoc</w:t>
+      </w:r>
+    </w:p>
+    <w:p>
+      <w:r>
+        <w:t>Customer co the gui request nap tien va xem lich su/trang thai request ngay tren giao dien.</w:t>
+      </w:r>
+    </w:p>
+    <w:p>
+      <w:r>
+        <w:t>Admin co the duyet nhanh tung request dang cho va theo doi lich su request da xu ly.</w:t>
+      </w:r>
+    </w:p>
+    <w:p>
+      <w:r>
+        <w:t>Du lieu vi tien duoc cap nhat tu dong khi request duoc chap nhan.</w:t>
+      </w:r>
+    </w:p>
+    <w:p>
+      <w:r>
+        <w:t>Menu he thong da hien thi theo role, tranh hien cac muc khong phu hop voi admin/customer.</w:t>
+      </w:r>
+    </w:p>
+    <w:p/>
+    <w:p>
+      <w:r>
+        <w:t>4. File thay doi chinh</w:t>
+      </w:r>
+    </w:p>
+    <w:p>
+      <w:r>
+        <w:t>banhang/urls.py</w:t>
+      </w:r>
+    </w:p>
+    <w:p>
+      <w:r>
+        <w:t>templates/topup_request.html</w:t>
+      </w:r>
+    </w:p>
+    <w:p>
+      <w:r>
+        <w:t>templates/topup_admin_review.html</w:t>
+      </w:r>
+    </w:p>
+    <w:p>
+      <w:r>
+        <w:t>templates/home.html</w:t>
+      </w:r>
+    </w:p>
+    <w:p>
+      <w:r>
+        <w:t>templates/product_detail.html</w:t>
+      </w:r>
+    </w:p>
+    <w:p>
+      <w:r>
+        <w:t>templates/admin_product_create.html</w:t>
+      </w:r>
+    </w:p>
+    <w:p>
+      <w:r>
+        <w:t>templates/admin_sales_stats.html</w:t>
+      </w:r>
+    </w:p>
+    <w:p>
+      <w:r>
+        <w:t>sql/admin_sales_stats.sql</w:t>
+      </w:r>
+    </w:p>
+    <w:p/>
+    <w:p>
+      <w:r>
+        <w:t>5. Kiem tra</w:t>
+      </w:r>
+    </w:p>
+    <w:p>
+      <w:r>
+        <w:t>python manage.py check: pass.</w:t>
+      </w:r>
+    </w:p>
+    <w:p>
+      <w:r>
+        <w:t>Kiem tra luong customer gui request -&gt; admin chap nhan -&gt; vi duoc cong: pass.</w:t>
+      </w:r>
+    </w:p>
+    <w:p>
+      <w:r>
+        <w:t>Kiem tra phan quyen route nap tien va menu theo role: pass.</w:t>
+      </w:r>
+    </w:p>
+    <w:p>
+      <w:r>
+        <w:t/>
+      </w:r>
+    </w:p>
+    <w:p>
+      <w:r>
+        <w:t>Bao cao bo sung 6: CAP_NHAT_COMMIT_2026-04-14</w:t>
+      </w:r>
+    </w:p>
+    <w:p>
+      <w:r>
+        <w:t>BAO CAO BO SUNG CHO LAN CAP NHAT TAI LIEU</w:t>
+      </w:r>
+    </w:p>
+    <w:p>
+      <w:r>
+        <w:t>Du an: Quan ly ban hang</w:t>
+      </w:r>
+    </w:p>
+    <w:p>
+      <w:r>
+        <w:t>Ngay cap nhat: 14/04/2026</w:t>
+      </w:r>
+    </w:p>
+    <w:p>
+      <w:r>
+        <w:t>1. Muc tieu</w:t>
+      </w:r>
+    </w:p>
+    <w:p>
+      <w:r>
+        <w:t>Cap nhat tai lieu bao cao tong hop vao file DOCX va chot lich su thay doi tren git.</w:t>
+      </w:r>
+    </w:p>
+    <w:p>
+      <w:r>
+        <w:t>2. Noi dung thuc hien</w:t>
+      </w:r>
+    </w:p>
+    <w:p>
+      <w:r>
+        <w:t>- Bo sung muc bao cao moi vao cuoi tai lieu BAO_CAO_TONG_HOP.docx.</w:t>
+      </w:r>
+    </w:p>
+    <w:p>
+      <w:r>
+        <w:t>- Dong bo mo ta trang thai du an den ngay 14/04/2026.</w:t>
+      </w:r>
+    </w:p>
+    <w:p>
+      <w:r>
+        <w:t>- Chuan bi commit rieng cho file tai lieu de de truy vet lich su cap nhat.</w:t>
+      </w:r>
+    </w:p>
+    <w:p>
+      <w:r>
+        <w:t>3. File cap nhat</w:t>
+      </w:r>
+    </w:p>
+    <w:p>
+      <w:r>
+        <w:t>docs/BAO_CAO_TONG_HOP.docx</w:t>
+      </w:r>
+    </w:p>
+    <w:p>
+      <w:r>
+        <w:t>4. Ghi chu</w:t>
+      </w:r>
+    </w:p>
+    <w:p>
+      <w:r>
+        <w:t>Noi dung bao cao duoc bo sung de phuc vu ban giao tai lieu va luu vet cong viec.</w:t>
+      </w:r>
+    </w:p>
     <w:sectPr>
       <w:pgSz w:w="12240" w:h="15840"/>
       <w:pgMar w:top="1440" w:right="1800" w:bottom="1440" w:left="1800" w:header="720" w:footer="720" w:gutter="0"/>

</xml_diff>

<commit_message>
feat: bổ sung checkout/đơn hàng/ví, đồng bộ menu và cập nhật báo cáo
</commit_message>
<xml_diff>
--- a/docs/BAO_CAO_TONG_HOP.docx
+++ b/docs/BAO_CAO_TONG_HOP.docx
@@ -1,1106 +1,1377 @@
 
 <file path=word/document.xml><?xml version="1.0" encoding="utf-8"?>
-<w:document xmlns:ns1="http://schemas.openxmlformats.org/markup-compatibility/2006" xmlns:w="http://schemas.openxmlformats.org/wordprocessingml/2006/main" ns1:Ignorable="w14 wp14">
+<w:document xmlns:wpc="http://schemas.microsoft.com/office/word/2010/wordprocessingCanvas" xmlns:mo="http://schemas.microsoft.com/office/mac/office/2008/main" xmlns:mc="http://schemas.openxmlformats.org/markup-compatibility/2006" xmlns:mv="urn:schemas-microsoft-com:mac:vml" xmlns:o="urn:schemas-microsoft-com:office:office" xmlns:r="http://schemas.openxmlformats.org/officeDocument/2006/relationships" xmlns:m="http://schemas.openxmlformats.org/officeDocument/2006/math" xmlns:v="urn:schemas-microsoft-com:vml" xmlns:wp14="http://schemas.microsoft.com/office/word/2010/wordprocessingDrawing" xmlns:wp="http://schemas.openxmlformats.org/drawingml/2006/wordprocessingDrawing" xmlns:w10="urn:schemas-microsoft-com:office:word" xmlns:w="http://schemas.openxmlformats.org/wordprocessingml/2006/main" xmlns:w14="http://schemas.microsoft.com/office/word/2010/wordml" xmlns:wpg="http://schemas.microsoft.com/office/word/2010/wordprocessingGroup" xmlns:wpi="http://schemas.microsoft.com/office/word/2010/wordprocessingInk" xmlns:wne="http://schemas.microsoft.com/office/word/2006/wordml" xmlns:wps="http://schemas.microsoft.com/office/word/2010/wordprocessingShape" mc:Ignorable="w14 wp14">
   <w:body>
     <w:p>
-      <w:pPr>
-        <w:pStyle w:val="Heading1"/>
-      </w:pPr>
       <w:r>
-        <w:t>BAO CAO TONG HOP</w:t>
-      </w:r>
-    </w:p>
-    <w:p>
-      <w:pPr>
-        <w:pStyle w:val="Heading2"/>
-      </w:pPr>
-      <w:r>
-        <w:t>Bao cao 1: BAO_CAO_TONG_HOP_2026-04-04</w:t>
+        <w:rPr>
+          <w:rFonts w:ascii="Times New Roman" w:hAnsi="Times New Roman" w:eastAsia="Times New Roman"/>
+          <w:sz w:val="24"/>
+        </w:rPr>
+        <w:t>BÁO CÁO TỔNG HỢP DỰ ÁN BÁN HÀNG</w:t>
       </w:r>
     </w:p>
     <w:p>
       <w:r>
-        <w:t>BAO CAO TONG HOP DU AN BAN HANG</w:t>
-      </w:r>
-    </w:p>
-    <w:p>
-      <w:r>
-        <w:t>Ngay cap nhat: 2026-04-04</w:t>
-      </w:r>
-    </w:p>
-    <w:p>
-      <w:r>
-        <w:t>Tai lieu nay gop noi dung tu 3 file docs hien co va bo sung bao cao cong viec hom nay.</w:t>
-      </w:r>
-    </w:p>
-    <w:p>
-      <w:r>
-        <w:t>Phan 1: Noi dung tu BAO_CAO_NGAY_2026-04-03.docx</w:t>
-      </w:r>
-    </w:p>
-    <w:p>
-      <w:r>
-        <w:t>BAO CAO THAY DOI DU AN BANHANG (DJANGO)</w:t>
-      </w:r>
-    </w:p>
-    <w:p>
-      <w:r>
-        <w:t>BAO CAO NGAY HOM QUA: 03/04/2026</w:t>
-      </w:r>
-    </w:p>
-    <w:p>
-      <w:r>
-        <w:t>Thoi diem tao bao cao: 04/04/2026 00:19:47 (UTC+07:00)</w:t>
-      </w:r>
-    </w:p>
-    <w:p>
-      <w:r>
-        <w:t>Noi dung thuc hien trong ngay 03/04/2026:</w:t>
-      </w:r>
-    </w:p>
-    <w:p>
-      <w:r>
-        <w:t>- Tao moi truong ao Python .venv va cai dat Django 6.0.3</w:t>
-      </w:r>
-    </w:p>
-    <w:p>
-      <w:r>
-        <w:t>- Khoi tao project Django banhang va chay migration mac dinh</w:t>
-      </w:r>
-    </w:p>
-    <w:p>
-      <w:r>
-        <w:t>- Cau hinh ket noi MySQL cho du an</w:t>
-      </w:r>
-    </w:p>
-    <w:p>
-      <w:r>
-        <w:t>- Tao app accounts, products, orders (khung app co ban)</w:t>
-      </w:r>
-    </w:p>
-    <w:p>
-      <w:r>
-        <w:t>- Dua template login/register vao project</w:t>
-      </w:r>
-    </w:p>
-    <w:p>
-      <w:r>
-        <w:t>- Tao thu muc static, templates va them CSS giao dien</w:t>
-      </w:r>
-    </w:p>
-    <w:p>
-      <w:r>
-        <w:t>- Them route home/login/register de render duoc giao dien</w:t>
-      </w:r>
-    </w:p>
-    <w:p>
-      <w:r>
-        <w:t>Phan 2: Noi dung tu THAY_DOI_DU_AN_BANHANG.docx</w:t>
-      </w:r>
-    </w:p>
-    <w:p>
-      <w:r>
-        <w:t>BIEN BAN THAY DOI DU AN BANHANG (DJANGO)</w:t>
-      </w:r>
-    </w:p>
-    <w:p>
-      <w:r>
-        <w:t>Ngay cap nhat: 03/04/2026 23:34:09 (UTC+07:00)</w:t>
-      </w:r>
-    </w:p>
-    <w:p>
-      <w:r>
-        <w:t>1) CAC THAY DOI DA THUC HIEN</w:t>
-      </w:r>
-    </w:p>
-    <w:p>
-      <w:r>
-        <w:t>- Tao moi truong ao Python .venv</w:t>
-      </w:r>
-    </w:p>
-    <w:p>
-      <w:r>
-        <w:t>- Cai dat Django 6.0.3</w:t>
-      </w:r>
-    </w:p>
-    <w:p>
-      <w:r>
-        <w:t>- Khoi tao project Django: banhang</w:t>
-      </w:r>
-    </w:p>
-    <w:p>
-      <w:r>
-        <w:t>- Tao cau truc co ban: manage.py, banhang/settings.py, banhang/urls.py</w:t>
-      </w:r>
-    </w:p>
-    <w:p>
-      <w:r>
-        <w:t>- Chay migration mac dinh cho admin/auth/contenttypes/sessions</w:t>
-      </w:r>
-    </w:p>
-    <w:p>
-      <w:r>
-        <w:t>- Tao file CSDL ban dau: db.sqlite3</w:t>
-      </w:r>
-    </w:p>
-    <w:p>
-      <w:r>
-        <w:t>2) CAP NHAT MYSQL</w:t>
-      </w:r>
-    </w:p>
-    <w:p>
-      <w:r>
-        <w:t>- Cau hinh Django su dung backend MySQL trong settings.py</w:t>
-      </w:r>
-    </w:p>
-    <w:p>
-      <w:r>
-        <w:t>- Them dependency mysqlclient==2.2.8 trong requirements.txt</w:t>
-      </w:r>
-    </w:p>
-    <w:p>
-      <w:r>
-        <w:t>- Tao file mau bien moi truong: .env.mysql.example</w:t>
-      </w:r>
-    </w:p>
-    <w:p>
-      <w:r>
-        <w:t>- Nguoi dung xac nhan da ket noi DB MySQL thanh cong</w:t>
-      </w:r>
-    </w:p>
-    <w:p>
-      <w:r>
-        <w:t>3) FILE LIEN QUAN</w:t>
-      </w:r>
-    </w:p>
-    <w:p>
-      <w:r>
-        <w:t>- banhang/settings.py</w:t>
-      </w:r>
-    </w:p>
-    <w:p>
-      <w:r>
-        <w:t>- requirements.txt</w:t>
-      </w:r>
-    </w:p>
-    <w:p>
-      <w:r>
-        <w:t>- .env.mysql.example</w:t>
-      </w:r>
-    </w:p>
-    <w:p>
-      <w:r>
-        <w:t>Phan 3: Noi dung tu THAY_DOI_DU_AN_BANHANG_MERGED.docx</w:t>
-      </w:r>
-    </w:p>
-    <w:p>
-      <w:r>
-        <w:t>BAO CAO THAY DOI DU AN BANHANG (DJANGO)</w:t>
-      </w:r>
-    </w:p>
-    <w:p>
-      <w:r>
-        <w:t>Ngay cap nhat bao cao: 04/04/2026 00:22:30 (UTC+07:00)</w:t>
-      </w:r>
-    </w:p>
-    <w:p>
-      <w:r>
-        <w:t>A. NOI DUNG TONG HOP</w:t>
-      </w:r>
-    </w:p>
-    <w:p>
-      <w:r>
-        <w:t>1) CAC THAY DOI DA THUC HIEN</w:t>
-      </w:r>
-    </w:p>
-    <w:p>
-      <w:r>
-        <w:t>- Tao moi truong ao Python .venv</w:t>
-      </w:r>
-    </w:p>
-    <w:p>
-      <w:r>
-        <w:t>- Cai dat Django 6.0.3</w:t>
-      </w:r>
-    </w:p>
-    <w:p>
-      <w:r>
-        <w:t>- Khoi tao project Django: banhang</w:t>
-      </w:r>
-    </w:p>
-    <w:p>
-      <w:r>
-        <w:t>- Tao cau truc co ban: manage.py, banhang/settings.py, banhang/urls.py</w:t>
-      </w:r>
-    </w:p>
-    <w:p>
-      <w:r>
-        <w:t>- Chay migration mac dinh cho admin/auth/contenttypes/sessions</w:t>
-      </w:r>
-    </w:p>
-    <w:p>
-      <w:r>
-        <w:t>- Tao file CSDL ban dau: db.sqlite3</w:t>
-      </w:r>
-    </w:p>
-    <w:p>
-      <w:r>
-        <w:t>2) CAP NHAT MYSQL</w:t>
-      </w:r>
-    </w:p>
-    <w:p>
-      <w:r>
-        <w:t>- Cau hinh Django su dung backend MySQL trong settings.py</w:t>
-      </w:r>
-    </w:p>
-    <w:p>
-      <w:r>
-        <w:t>- Them dependency mysqlclient==2.2.8 trong requirements.txt</w:t>
-      </w:r>
-    </w:p>
-    <w:p>
-      <w:r>
-        <w:t>- Tao file mau bien moi truong: .env.mysql.example</w:t>
-      </w:r>
-    </w:p>
-    <w:p>
-      <w:r>
-        <w:t>- Nguoi dung xac nhan da ket noi DB MySQL thanh cong</w:t>
-      </w:r>
-    </w:p>
-    <w:p>
-      <w:r>
-        <w:t>3) FILE LIEN QUAN</w:t>
-      </w:r>
-    </w:p>
-    <w:p>
-      <w:r>
-        <w:t>- banhang/settings.py</w:t>
-      </w:r>
-    </w:p>
-    <w:p>
-      <w:r>
-        <w:t>- requirements.txt</w:t>
-      </w:r>
-    </w:p>
-    <w:p>
-      <w:r>
-        <w:t>- .env.mysql.example</w:t>
-      </w:r>
-    </w:p>
-    <w:p>
-      <w:r>
-        <w:t>B. BO SUNG BAO CAO NGAY 03/04/2026</w:t>
-      </w:r>
-    </w:p>
-    <w:p>
-      <w:r>
-        <w:t>Noi dung thuc hien trong ngay 03/04/2026:</w:t>
-      </w:r>
-    </w:p>
-    <w:p>
-      <w:r>
-        <w:t>- Tao moi truong ao Python .venv va cai dat Django 6.0.3</w:t>
-      </w:r>
-    </w:p>
-    <w:p>
-      <w:r>
-        <w:t>- Khoi tao project Django banhang va chay migration mac dinh</w:t>
-      </w:r>
-    </w:p>
-    <w:p>
-      <w:r>
-        <w:t>- Cau hinh ket noi MySQL cho du an</w:t>
-      </w:r>
-    </w:p>
-    <w:p>
-      <w:r>
-        <w:t>- Tao app accounts, products, orders (khung app co ban)</w:t>
-      </w:r>
-    </w:p>
-    <w:p>
-      <w:r>
-        <w:t>- Dua template login/register vao project</w:t>
-      </w:r>
-    </w:p>
-    <w:p>
-      <w:r>
-        <w:t>- Tao thu muc static, templates va them CSS giao dien</w:t>
-      </w:r>
-    </w:p>
-    <w:p>
-      <w:r>
-        <w:t>- Them route home/login/register de render duoc giao dien</w:t>
-      </w:r>
-    </w:p>
-    <w:p>
-      <w:r>
-        <w:t>Bao cao cong viec ngay 2026-04-04</w:t>
-      </w:r>
-    </w:p>
-    <w:p>
-      <w:r>
-        <w:t>Pham vi: Hoan thien cau truc doi tuong theo UML, khong tao chuc nang nghiep vu.</w:t>
-      </w:r>
-    </w:p>
-    <w:p>
-      <w:r>
-        <w:t>Cap nhat cau hinh du an: them 3 app accounts, products, orders vao INSTALLED_APPS.</w:t>
-      </w:r>
-    </w:p>
-    <w:p>
-      <w:r>
-        <w:t>Xay dung model theo class diagram trong UML cho cac nhom doi tuong: Customer, Wallet, TopUpRequest, Product, Cart, CartItem, DiscountCode, Order, OrderDetail.</w:t>
-      </w:r>
-    </w:p>
-    <w:p>
-      <w:r>
-        <w:t>Khai bao day du quan he du lieu: OneToOne va ForeignKey voi related_name theo so do.</w:t>
-      </w:r>
-    </w:p>
-    <w:p>
-      <w:r>
-        <w:t>Khai bao choices cho cac trang thai/gioi tinh: Gender, TopUpRequest.Status, Order.Status.</w:t>
-      </w:r>
-    </w:p>
-    <w:p>
-      <w:r>
-        <w:t>Tao migrations ban dau: accounts/migrations/0001_initial.py, products/migrations/0001_initial.py, orders/migrations/0001_initial.py.</w:t>
-      </w:r>
-    </w:p>
-    <w:p>
-      <w:r>
-        <w:t>Bo sung phu thuoc Pillow de ho tro ImageField trong Product.</w:t>
-      </w:r>
-    </w:p>
-    <w:p>
-      <w:r>
-        <w:t>Da kiem tra: makemigrations khong con thay doi moi, va manage.py check khong bao loi he thong.</w:t>
-      </w:r>
-    </w:p>
-    <w:p>
-      <w:r>
-        <w:t>Gioi han pham vi: chua tao view, form, API, business logic hay chuc nang xu ly don hang/thanh toan.</w:t>
-      </w:r>
-    </w:p>
-    <w:p>
-      <w:r>
-        <w:t>Cap nhat bo sung cuoi ngay 2026-04-04</w:t>
-      </w:r>
-    </w:p>
-    <w:p>
-      <w:r>
-        <w:t>Noi dung bo sung sau khi hoan thien model va migration:</w:t>
-      </w:r>
-    </w:p>
-    <w:p>
-      <w:r>
-        <w:t>Cap nhat cau hinh database trong settings de dung bien MYSQL_* va default database quan_ly_ban_hang_db.</w:t>
-      </w:r>
-    </w:p>
-    <w:p>
-      <w:r>
-        <w:t>Tao database quan_ly_ban_hang_db tren MySQL va thuc hien migrate thanh cong cho accounts/products/orders.</w:t>
-      </w:r>
-    </w:p>
-    <w:p>
-      <w:r>
-        <w:t>Xac nhan ket noi thuc te den database quan_ly_ban_hang_db.</w:t>
-      </w:r>
-    </w:p>
-    <w:p>
-      <w:r>
-        <w:t>Viet unit test cho 3 app: accounts, products, orders.</w:t>
-      </w:r>
-    </w:p>
-    <w:p>
-      <w:r>
-        <w:t>Chay test suite: 14 test pass (OK) voi lenh python manage.py test accounts products orders -v 2.</w:t>
-      </w:r>
-    </w:p>
-    <w:p>
-      <w:r>
-        <w:t>Ket qua tong quan: he thong check khong loi, migration day du, model relation hoat dong dung theo UML.</w:t>
-      </w:r>
-    </w:p>
-    <w:p>
-      <w:pPr>
-        <w:pStyle w:val="Heading2"/>
-      </w:pPr>
-      <w:r>
-        <w:t>Bao cao 2: BAO_CAO_TONG_HOP_2026-04-06</w:t>
-      </w:r>
-    </w:p>
-    <w:p>
-      <w:r>
-        <w:t>BAO CAO CONG VIEC NGAY 06/04/2026</w:t>
-      </w:r>
-    </w:p>
-    <w:p>
-      <w:r>
-        <w:t>Du an: Quan ly ban hang</w:t>
-      </w:r>
-    </w:p>
-    <w:p>
-      <w:r>
-        <w:t>Ngay bao cao: 06/04/2026</w:t>
-      </w:r>
-    </w:p>
-    <w:p>
-      <w:r>
-        <w:t>1. Muc tieu trong ngay</w:t>
-      </w:r>
-    </w:p>
-    <w:p>
-      <w:r>
-        <w:t>Dieu chinh giao dien va luong dang nhap/phien lam viec theo vai tro admin va nguoi dung.</w:t>
-      </w:r>
-    </w:p>
-    <w:p>
-      <w:r>
-        <w:t>Chuan hoa cach truy van du lieu theo file SQL.</w:t>
-      </w:r>
-    </w:p>
-    <w:p>
-      <w:r>
-        <w:t>2. Hang muc da hoan thanh</w:t>
-      </w:r>
-    </w:p>
-    <w:p>
-      <w:r>
-        <w:t>Bo sung nut Dang xuat va route logout cho he thong.</w:t>
-      </w:r>
-    </w:p>
-    <w:p>
-      <w:r>
-        <w:t>Xoa luong Dashboard va Django Admin khi dang nhap bang tai khoan admin.</w:t>
-      </w:r>
-    </w:p>
-    <w:p>
-      <w:r>
-        <w:t>Cap nhat section nap tien: admin hien thi Yeu cau nap tien (PENDING), nguoi dung hien thi Lich su yeu cau nap tien cua chinh minh.</w:t>
-      </w:r>
-    </w:p>
-    <w:p>
-      <w:r>
-        <w:t>Don dep SQL: xoa file topup_history_staff.sql, giu file topup_requests_staff.sql va topup_history_by_user.sql.</w:t>
-      </w:r>
-    </w:p>
-    <w:p>
-      <w:r>
-        <w:t>Thiet ke lai trang dang ky/dang nhap de dong bo mau nen, font chu va phong cach voi trang chu.</w:t>
-      </w:r>
-    </w:p>
-    <w:p>
-      <w:r>
-        <w:t>3. Ket qua kiem thu</w:t>
-      </w:r>
-    </w:p>
-    <w:p>
-      <w:r>
-        <w:t>python manage.py test: 22/22 test passed.</w:t>
-      </w:r>
-    </w:p>
-    <w:p>
-      <w:r>
-        <w:t>python manage.py check: System check identified no issues.</w:t>
-      </w:r>
-    </w:p>
-    <w:p>
-      <w:r>
-        <w:t>4. File thay doi chinh</w:t>
-      </w:r>
-    </w:p>
-    <w:p>
-      <w:r>
-        <w:t>banhang/urls.py</w:t>
-      </w:r>
-    </w:p>
-    <w:p>
-      <w:r>
-        <w:t>templates/home.html</w:t>
-      </w:r>
-    </w:p>
-    <w:p>
-      <w:r>
-        <w:t>templates/login.html</w:t>
-      </w:r>
-    </w:p>
-    <w:p>
-      <w:r>
-        <w:t>templates/register.html</w:t>
-      </w:r>
-    </w:p>
-    <w:p>
-      <w:r>
-        <w:t>static/css/page_theme.css</w:t>
-      </w:r>
-    </w:p>
-    <w:p>
-      <w:r>
-        <w:t>static/css/style.css</w:t>
-      </w:r>
-    </w:p>
-    <w:p>
-      <w:r>
-        <w:t>sql/topup_requests_staff.sql</w:t>
-      </w:r>
-    </w:p>
-    <w:p>
-      <w:r>
-        <w:t>sql/topup_history_by_user.sql</w:t>
-      </w:r>
-    </w:p>
-    <w:p>
-      <w:r>
-        <w:t>accounts/tests.py</w:t>
-      </w:r>
-    </w:p>
-    <w:p>
-      <w:r>
-        <w:t>5. Ke hoach tiep theo</w:t>
-      </w:r>
-    </w:p>
-    <w:p>
-      <w:r>
-        <w:t>Neu can, bo sung thao tac duyet/tu choi yeu cau nap tien truc tiep tren giao dien.</w:t>
-      </w:r>
-    </w:p>
-    <w:p>
-      <w:r>
-        <w:t>Hoan thien tai lieu huong dan su dung cho admin va nguoi dung.</w:t>
-      </w:r>
-    </w:p>
-    <w:p>
-      <w:r>
-        <w:t>Bao cao bo sung 3: CAP_NHAT_MODEL_2026-04-09</w:t>
-      </w:r>
-    </w:p>
-    <w:p>
-      <w:r>
-        <w:t>BAO CAO CAP NHAT MODEL NGAY 09/04/2026</w:t>
-      </w:r>
-    </w:p>
-    <w:p>
-      <w:r>
-        <w:t>Du an: Quan ly ban hang</w:t>
-      </w:r>
-    </w:p>
-    <w:p>
-      <w:r>
-        <w:t>Ngay cap nhat: 09/04/2026</w:t>
-      </w:r>
-    </w:p>
-    <w:p>
-      <w:r>
-        <w:t>1. Muc tieu cap nhat</w:t>
-      </w:r>
-    </w:p>
-    <w:p>
-      <w:r>
-        <w:t>Hoan thien model nghiep vu cho app orders va app products de san sang cho cac buoc view/service checkout.</w:t>
-      </w:r>
-    </w:p>
-    <w:p>
-      <w:r>
-        <w:t>2. Noi dung da thuc hien</w:t>
-      </w:r>
-    </w:p>
-    <w:p>
-      <w:r>
-        <w:t>Orders: bo sung helper tinh tong tien don hang (recalculate_totals), tu dong tinh discount/sub_total cho OrderDetail, validate du lieu dau vao va them __str__/ordering.</w:t>
-      </w:r>
-    </w:p>
-    <w:p>
-      <w:r>
-        <w:t>Orders: chuan hoa thong bao loi ValidationError bang tieng Viet (khong dau) va them ghi chu tai cac doan code moi.</w:t>
-      </w:r>
-    </w:p>
-    <w:p>
-      <w:r>
-        <w:t>Products: bo sung helper gia sau giam (discounted_price), dinh dang gia hien thi (formatted_price), validate gia/ton kho/ty le giam gia.</w:t>
-      </w:r>
-    </w:p>
-    <w:p>
-      <w:r>
-        <w:t>Products: bo sung tinh toan tu dong cho CartItem (discount_amount, sub_total), helper tong hop Cart (total_items, total_amount), va xu ly hop le cho DiscountCode (is_valid, mark_as_used).</w:t>
-      </w:r>
-    </w:p>
-    <w:p>
-      <w:r>
-        <w:t>3. Ket qua kiem thu</w:t>
-      </w:r>
-    </w:p>
-    <w:p>
-      <w:r>
-        <w:t>python manage.py test orders: 7/7 test pass.</w:t>
-      </w:r>
-    </w:p>
-    <w:p>
-      <w:r>
-        <w:t>python manage.py test products: 9/9 test pass.</w:t>
-      </w:r>
-    </w:p>
-    <w:p>
-      <w:r>
-        <w:t>python manage.py test: 29/29 test pass.</w:t>
-      </w:r>
-    </w:p>
-    <w:p>
-      <w:r>
-        <w:t>4. File thay doi chinh</w:t>
-      </w:r>
-    </w:p>
-    <w:p>
-      <w:r>
-        <w:t>orders/models.py</w:t>
-      </w:r>
-    </w:p>
-    <w:p>
-      <w:r>
-        <w:t>orders/tests.py</w:t>
-      </w:r>
-    </w:p>
-    <w:p>
-      <w:r>
-        <w:t>products/models.py</w:t>
-      </w:r>
-    </w:p>
-    <w:p>
-      <w:r>
-        <w:t>products/tests.py</w:t>
-      </w:r>
-    </w:p>
-    <w:p>
-      <w:r>
-        <w:t>5. Ghi chu</w:t>
-      </w:r>
-    </w:p>
-    <w:p>
-      <w:r>
-        <w:t>Chua mo rong sang views/forms/API trong lan cap nhat nay; tam thoi tap trung vao data model, validation va tinh toan nghiep vu co ban.</w:t>
+        <w:rPr>
+          <w:rFonts w:ascii="Times New Roman" w:hAnsi="Times New Roman" w:eastAsia="Times New Roman"/>
+          <w:sz w:val="24"/>
+        </w:rPr>
+        <w:t>Ngày cập nhật tài liệu: 03/05/2026 20:21</w:t>
       </w:r>
     </w:p>
     <w:p/>
     <w:p>
       <w:r>
-        <w:t>Bao cao bo sung 4: CAP_NHAT_2026-04-10_DEN_2026-04-13</w:t>
+        <w:rPr>
+          <w:rFonts w:ascii="Times New Roman" w:hAnsi="Times New Roman" w:eastAsia="Times New Roman"/>
+          <w:sz w:val="24"/>
+        </w:rPr>
+        <w:t>MỤC ĐÍCH TÀI LIỆU</w:t>
       </w:r>
     </w:p>
     <w:p>
       <w:r>
-        <w:t>BAO CAO CAP NHAT TU NGAY 10/04/2026 DEN 13/04/2026</w:t>
-      </w:r>
-    </w:p>
-    <w:p>
-      <w:r>
-        <w:t>Du an: Quan ly ban hang</w:t>
-      </w:r>
-    </w:p>
-    <w:p>
-      <w:r>
-        <w:t>Khoang thoi gian: 10/04/2026 - 13/04/2026</w:t>
+        <w:rPr>
+          <w:rFonts w:ascii="Times New Roman" w:hAnsi="Times New Roman" w:eastAsia="Times New Roman"/>
+          <w:sz w:val="24"/>
+        </w:rPr>
+        <w:t>Tài liệu này tổng hợp toàn bộ các mốc thay đổi chính của dự án Quản lý bán hàng, được viết lại bằng tiếng Việt có dấu để dễ theo dõi và lưu trữ.</w:t>
       </w:r>
     </w:p>
     <w:p/>
     <w:p>
       <w:r>
-        <w:t>1. Muc tieu cap nhat</w:t>
+        <w:rPr>
+          <w:rFonts w:ascii="Times New Roman" w:hAnsi="Times New Roman" w:eastAsia="Times New Roman"/>
+          <w:sz w:val="24"/>
+        </w:rPr>
+        <w:t>I. BÁO CÁO TỔNG HỢP MỐC 03/04/2026 - 04/04/2026</w:t>
       </w:r>
     </w:p>
     <w:p>
       <w:r>
-        <w:t>Dong bo giao dien Home, Product Detail va cac trang Admin.</w:t>
+        <w:rPr>
+          <w:rFonts w:ascii="Times New Roman" w:hAnsi="Times New Roman" w:eastAsia="Times New Roman"/>
+          <w:sz w:val="24"/>
+        </w:rPr>
+        <w:t>1) Các hạng mục đã thực hiện</w:t>
       </w:r>
     </w:p>
     <w:p>
       <w:r>
-        <w:t>Bo sung phan quyen menu theo vai tro admin/customer.</w:t>
+        <w:rPr>
+          <w:rFonts w:ascii="Times New Roman" w:hAnsi="Times New Roman" w:eastAsia="Times New Roman"/>
+          <w:sz w:val="24"/>
+        </w:rPr>
+        <w:t>- Tạo môi trường ảo Python `.venv` và cài đặt Django 6.0.3.</w:t>
       </w:r>
     </w:p>
     <w:p>
       <w:r>
-        <w:t>Tao trang Admin them san pham va trang thong ke ban hang su dung truy van SQL.</w:t>
+        <w:rPr>
+          <w:rFonts w:ascii="Times New Roman" w:hAnsi="Times New Roman" w:eastAsia="Times New Roman"/>
+          <w:sz w:val="24"/>
+        </w:rPr>
+        <w:t>- Khởi tạo project Django `banhang`, sinh cấu trúc cơ bản và chạy migration mặc định.</w:t>
       </w:r>
     </w:p>
     <w:p>
       <w:r>
-        <w:t>Chuan bi cau truc mo rong bo loc/danh muc san pham tren trang chu.</w:t>
+        <w:rPr>
+          <w:rFonts w:ascii="Times New Roman" w:hAnsi="Times New Roman" w:eastAsia="Times New Roman"/>
+          <w:sz w:val="24"/>
+        </w:rPr>
+        <w:t>- Tạo các app `accounts`, `products`, `orders` (khung app ban đầu).</w:t>
+      </w:r>
+    </w:p>
+    <w:p>
+      <w:r>
+        <w:rPr>
+          <w:rFonts w:ascii="Times New Roman" w:hAnsi="Times New Roman" w:eastAsia="Times New Roman"/>
+          <w:sz w:val="24"/>
+        </w:rPr>
+        <w:t>- Cấu hình kết nối MySQL trong `settings.py`.</w:t>
+      </w:r>
+    </w:p>
+    <w:p>
+      <w:r>
+        <w:rPr>
+          <w:rFonts w:ascii="Times New Roman" w:hAnsi="Times New Roman" w:eastAsia="Times New Roman"/>
+          <w:sz w:val="24"/>
+        </w:rPr>
+        <w:t>- Thêm `mysqlclient==2.2.8` vào `requirements.txt`.</w:t>
+      </w:r>
+    </w:p>
+    <w:p>
+      <w:r>
+        <w:rPr>
+          <w:rFonts w:ascii="Times New Roman" w:hAnsi="Times New Roman" w:eastAsia="Times New Roman"/>
+          <w:sz w:val="24"/>
+        </w:rPr>
+        <w:t>- Tạo file mẫu biến môi trường `.env.mysql.example`.</w:t>
+      </w:r>
+    </w:p>
+    <w:p>
+      <w:r>
+        <w:rPr>
+          <w:rFonts w:ascii="Times New Roman" w:hAnsi="Times New Roman" w:eastAsia="Times New Roman"/>
+          <w:sz w:val="24"/>
+        </w:rPr>
+        <w:t>- Bổ sung giao diện mẫu login/register, cấu trúc `templates/` và `static/`.</w:t>
+      </w:r>
+    </w:p>
+    <w:p>
+      <w:r>
+        <w:rPr>
+          <w:rFonts w:ascii="Times New Roman" w:hAnsi="Times New Roman" w:eastAsia="Times New Roman"/>
+          <w:sz w:val="24"/>
+        </w:rPr>
+        <w:t>- Thêm route `home`, `login`, `register` để render được giao diện.</w:t>
       </w:r>
     </w:p>
     <w:p/>
     <w:p>
       <w:r>
-        <w:t>2. Noi dung da thuc hien</w:t>
+        <w:rPr>
+          <w:rFonts w:ascii="Times New Roman" w:hAnsi="Times New Roman" w:eastAsia="Times New Roman"/>
+          <w:sz w:val="24"/>
+        </w:rPr>
+        <w:t>2) Mô hình dữ liệu theo UML (cập nhật 04/04/2026)</w:t>
       </w:r>
     </w:p>
     <w:p>
       <w:r>
-        <w:t>Khoi phuc aside Phan loai + Bo loc tren Home, render dong tu backend context de de mo rong.</w:t>
+        <w:rPr>
+          <w:rFonts w:ascii="Times New Roman" w:hAnsi="Times New Roman" w:eastAsia="Times New Roman"/>
+          <w:sz w:val="24"/>
+        </w:rPr>
+        <w:t>- Bổ sung 3 app vào `INSTALLED_APPS`.</w:t>
       </w:r>
     </w:p>
     <w:p>
       <w:r>
-        <w:t>Tao trang admin_product_create.html voi form: the loai, hinh anh chinh, toi da 6 anh phu, so luong, gia, ten, mo ta va preview anh.</w:t>
+        <w:rPr>
+          <w:rFonts w:ascii="Times New Roman" w:hAnsi="Times New Roman" w:eastAsia="Times New Roman"/>
+          <w:sz w:val="24"/>
+        </w:rPr>
+        <w:t>- Xây dựng model cho các nhóm đối tượng: `Customer`, `Wallet`, `TopUpRequest`, `Product`, `Cart`, `CartItem`, `DiscountCode`, `Order`, `OrderDetail`.</w:t>
       </w:r>
     </w:p>
     <w:p>
       <w:r>
-        <w:t>Tao trang admin_sales_stats.html hien thi thong ke: so nguoi dang ky, so don ban ra, doanh thu, tong san pham.</w:t>
+        <w:rPr>
+          <w:rFonts w:ascii="Times New Roman" w:hAnsi="Times New Roman" w:eastAsia="Times New Roman"/>
+          <w:sz w:val="24"/>
+        </w:rPr>
+        <w:t>- Khai báo quan hệ `OneToOne` và `ForeignKey` đầy đủ theo sơ đồ.</w:t>
       </w:r>
     </w:p>
     <w:p>
       <w:r>
-        <w:t>Them route /admin/thong-ke-ban-hang/ chi cho admin va lay so lieu bang SQL file dashboard_stats.sql.</w:t>
+        <w:rPr>
+          <w:rFonts w:ascii="Times New Roman" w:hAnsi="Times New Roman" w:eastAsia="Times New Roman"/>
+          <w:sz w:val="24"/>
+        </w:rPr>
+        <w:t>- Khai báo `choices` cho giới tính/trạng thái: `Gender`, `TopUpRequest.Status`, `Order.Status`.</w:t>
       </w:r>
     </w:p>
     <w:p>
       <w:r>
-        <w:t>Cap nhat menu: chi admin thay Them san pham + Thong ke ban hang; chi customer thay Vi tien + Gio hang.</w:t>
+        <w:rPr>
+          <w:rFonts w:ascii="Times New Roman" w:hAnsi="Times New Roman" w:eastAsia="Times New Roman"/>
+          <w:sz w:val="24"/>
+        </w:rPr>
+        <w:t>- Tạo migration ban đầu cho 3 app.</w:t>
       </w:r>
     </w:p>
     <w:p>
       <w:r>
-        <w:t>Cap nhat route san-pham/preview va san-pham/&lt;id&gt;, dong bo giao dien product_detail voi home.</w:t>
+        <w:rPr>
+          <w:rFonts w:ascii="Times New Roman" w:hAnsi="Times New Roman" w:eastAsia="Times New Roman"/>
+          <w:sz w:val="24"/>
+        </w:rPr>
+        <w:t>- Bổ sung Pillow để hỗ trợ `ImageField` trong `Product`.</w:t>
       </w:r>
     </w:p>
     <w:p>
       <w:r>
-        <w:t>Don dep du lieu mau/hardcode trong cac template va views de san sang noi du lieu that.</w:t>
+        <w:rPr>
+          <w:rFonts w:ascii="Times New Roman" w:hAnsi="Times New Roman" w:eastAsia="Times New Roman"/>
+          <w:sz w:val="24"/>
+        </w:rPr>
+        <w:t>- Kiểm tra: `makemigrations` không còn thay đổi mới, `manage.py check` không báo lỗi.</w:t>
       </w:r>
     </w:p>
     <w:p/>
     <w:p>
       <w:r>
-        <w:t>3. File thay doi chinh</w:t>
+        <w:rPr>
+          <w:rFonts w:ascii="Times New Roman" w:hAnsi="Times New Roman" w:eastAsia="Times New Roman"/>
+          <w:sz w:val="24"/>
+        </w:rPr>
+        <w:t>3) Bổ sung cuối ngày 04/04/2026</w:t>
       </w:r>
     </w:p>
     <w:p>
       <w:r>
-        <w:t>banhang/urls.py</w:t>
+        <w:rPr>
+          <w:rFonts w:ascii="Times New Roman" w:hAnsi="Times New Roman" w:eastAsia="Times New Roman"/>
+          <w:sz w:val="24"/>
+        </w:rPr>
+        <w:t>- Chuẩn hóa cấu hình DB dùng biến `MYSQL_*`, default database `quan_ly_ban_hang_db`.</w:t>
       </w:r>
     </w:p>
     <w:p>
       <w:r>
-        <w:t>templates/home.html</w:t>
+        <w:rPr>
+          <w:rFonts w:ascii="Times New Roman" w:hAnsi="Times New Roman" w:eastAsia="Times New Roman"/>
+          <w:sz w:val="24"/>
+        </w:rPr>
+        <w:t>- Tạo database trên MySQL và migrate thành công cho `accounts/products/orders`.</w:t>
       </w:r>
     </w:p>
     <w:p>
       <w:r>
-        <w:t>templates/product_detail.html</w:t>
+        <w:rPr>
+          <w:rFonts w:ascii="Times New Roman" w:hAnsi="Times New Roman" w:eastAsia="Times New Roman"/>
+          <w:sz w:val="24"/>
+        </w:rPr>
+        <w:t>- Xác nhận kết nối thực tế tới `quan_ly_ban_hang_db`.</w:t>
       </w:r>
     </w:p>
     <w:p>
       <w:r>
-        <w:t>templates/admin_product_create.html</w:t>
+        <w:rPr>
+          <w:rFonts w:ascii="Times New Roman" w:hAnsi="Times New Roman" w:eastAsia="Times New Roman"/>
+          <w:sz w:val="24"/>
+        </w:rPr>
+        <w:t>- Viết unit test cho 3 app.</w:t>
       </w:r>
     </w:p>
     <w:p>
       <w:r>
-        <w:t>templates/admin_sales_stats.html</w:t>
-      </w:r>
-    </w:p>
-    <w:p>
-      <w:r>
-        <w:t>products/views.py</w:t>
-      </w:r>
-    </w:p>
-    <w:p>
-      <w:r>
-        <w:t>products/urls.py</w:t>
-      </w:r>
-    </w:p>
-    <w:p>
-      <w:r>
-        <w:t>static/css/home.css</w:t>
+        <w:rPr>
+          <w:rFonts w:ascii="Times New Roman" w:hAnsi="Times New Roman" w:eastAsia="Times New Roman"/>
+          <w:sz w:val="24"/>
+        </w:rPr>
+        <w:t>- Chạy test suite: 14/14 test PASS.</w:t>
       </w:r>
     </w:p>
     <w:p/>
     <w:p>
       <w:r>
-        <w:t>4. Ket qua kiem tra</w:t>
+        <w:rPr>
+          <w:rFonts w:ascii="Times New Roman" w:hAnsi="Times New Roman" w:eastAsia="Times New Roman"/>
+          <w:sz w:val="24"/>
+        </w:rPr>
+        <w:t>II. BÁO CÁO CẬP NHẬT NGÀY 06/04/2026</w:t>
       </w:r>
     </w:p>
     <w:p>
       <w:r>
-        <w:t>python manage.py check: pass.</w:t>
+        <w:rPr>
+          <w:rFonts w:ascii="Times New Roman" w:hAnsi="Times New Roman" w:eastAsia="Times New Roman"/>
+          <w:sz w:val="24"/>
+        </w:rPr>
+        <w:t>1) Mục tiêu</w:t>
       </w:r>
     </w:p>
     <w:p>
       <w:r>
-        <w:t>Route admin them san pham truy cap duoc: /san-pham/admin/them-san-pham/.</w:t>
+        <w:rPr>
+          <w:rFonts w:ascii="Times New Roman" w:hAnsi="Times New Roman" w:eastAsia="Times New Roman"/>
+          <w:sz w:val="24"/>
+        </w:rPr>
+        <w:t>- Điều chỉnh giao diện và luồng đăng nhập/phiên làm việc theo vai trò admin và người dùng.</w:t>
       </w:r>
     </w:p>
     <w:p>
       <w:r>
-        <w:t>Route thong ke ban hang truy cap duoc voi admin: /admin/thong-ke-ban-hang/; user thuong bi chan.</w:t>
+        <w:rPr>
+          <w:rFonts w:ascii="Times New Roman" w:hAnsi="Times New Roman" w:eastAsia="Times New Roman"/>
+          <w:sz w:val="24"/>
+        </w:rPr>
+        <w:t>- Chuẩn hóa cách truy vấn dữ liệu theo file SQL.</w:t>
       </w:r>
     </w:p>
     <w:p>
       <w:r>
-        <w:t>Phan quyen menu theo role hoat dong dung tren home/product_detail/admin.</w:t>
+        <w:rPr>
+          <w:rFonts w:ascii="Times New Roman" w:hAnsi="Times New Roman" w:eastAsia="Times New Roman"/>
+          <w:sz w:val="24"/>
+        </w:rPr>
+        <w:t>2) Hạng mục hoàn thành</w:t>
+      </w:r>
+    </w:p>
+    <w:p>
+      <w:r>
+        <w:rPr>
+          <w:rFonts w:ascii="Times New Roman" w:hAnsi="Times New Roman" w:eastAsia="Times New Roman"/>
+          <w:sz w:val="24"/>
+        </w:rPr>
+        <w:t>- Bổ sung nút Đăng xuất và route `logout`.</w:t>
+      </w:r>
+    </w:p>
+    <w:p>
+      <w:r>
+        <w:rPr>
+          <w:rFonts w:ascii="Times New Roman" w:hAnsi="Times New Roman" w:eastAsia="Times New Roman"/>
+          <w:sz w:val="24"/>
+        </w:rPr>
+        <w:t>- Gỡ luồng Dashboard và Django Admin trong kịch bản login bằng tài khoản admin.</w:t>
+      </w:r>
+    </w:p>
+    <w:p>
+      <w:r>
+        <w:rPr>
+          <w:rFonts w:ascii="Times New Roman" w:hAnsi="Times New Roman" w:eastAsia="Times New Roman"/>
+          <w:sz w:val="24"/>
+        </w:rPr>
+        <w:t>- Cập nhật section nạp tiền: admin thấy danh sách pending, user thấy lịch sử của chính mình.</w:t>
+      </w:r>
+    </w:p>
+    <w:p>
+      <w:r>
+        <w:rPr>
+          <w:rFonts w:ascii="Times New Roman" w:hAnsi="Times New Roman" w:eastAsia="Times New Roman"/>
+          <w:sz w:val="24"/>
+        </w:rPr>
+        <w:t>- Dọn dẹp SQL, giữ lại các file truy vấn cần thiết.</w:t>
+      </w:r>
+    </w:p>
+    <w:p>
+      <w:r>
+        <w:rPr>
+          <w:rFonts w:ascii="Times New Roman" w:hAnsi="Times New Roman" w:eastAsia="Times New Roman"/>
+          <w:sz w:val="24"/>
+        </w:rPr>
+        <w:t>- Đồng bộ giao diện login/register với phong cách trang chủ.</w:t>
+      </w:r>
+    </w:p>
+    <w:p>
+      <w:r>
+        <w:rPr>
+          <w:rFonts w:ascii="Times New Roman" w:hAnsi="Times New Roman" w:eastAsia="Times New Roman"/>
+          <w:sz w:val="24"/>
+        </w:rPr>
+        <w:t>3) Kết quả kiểm thử</w:t>
+      </w:r>
+    </w:p>
+    <w:p>
+      <w:r>
+        <w:rPr>
+          <w:rFonts w:ascii="Times New Roman" w:hAnsi="Times New Roman" w:eastAsia="Times New Roman"/>
+          <w:sz w:val="24"/>
+        </w:rPr>
+        <w:t>- `python manage.py test`: 22/22 test PASS.</w:t>
+      </w:r>
+    </w:p>
+    <w:p>
+      <w:r>
+        <w:rPr>
+          <w:rFonts w:ascii="Times New Roman" w:hAnsi="Times New Roman" w:eastAsia="Times New Roman"/>
+          <w:sz w:val="24"/>
+        </w:rPr>
+        <w:t>- `python manage.py check`: không có issue hệ thống.</w:t>
       </w:r>
     </w:p>
     <w:p/>
     <w:p>
       <w:r>
-        <w:t>5. Ke hoach tiep theo</w:t>
+        <w:rPr>
+          <w:rFonts w:ascii="Times New Roman" w:hAnsi="Times New Roman" w:eastAsia="Times New Roman"/>
+          <w:sz w:val="24"/>
+        </w:rPr>
+        <w:t>III. BÁO CÁO CẬP NHẬT MODEL NGÀY 09/04/2026</w:t>
       </w:r>
     </w:p>
     <w:p>
       <w:r>
-        <w:t>Xu ly POST de luu form them san pham vao CSDL (kem upload media).</w:t>
+        <w:rPr>
+          <w:rFonts w:ascii="Times New Roman" w:hAnsi="Times New Roman" w:eastAsia="Times New Roman"/>
+          <w:sz w:val="24"/>
+        </w:rPr>
+        <w:t>1) Mục tiêu</w:t>
       </w:r>
     </w:p>
     <w:p>
       <w:r>
-        <w:t>Hoan thien truy van danh sach san pham + phan trang 12 san pham/trang theo thu tu admin.</w:t>
+        <w:rPr>
+          <w:rFonts w:ascii="Times New Roman" w:hAnsi="Times New Roman" w:eastAsia="Times New Roman"/>
+          <w:sz w:val="24"/>
+        </w:rPr>
+        <w:t>- Hoàn thiện model nghiệp vụ cho app `orders` và `products` để sẵn sàng cho các bước checkout.</w:t>
       </w:r>
     </w:p>
     <w:p>
       <w:r>
-        <w:t>Bo sung bieu do doanh thu va top san pham ban chay cho trang thong ke.</w:t>
+        <w:rPr>
+          <w:rFonts w:ascii="Times New Roman" w:hAnsi="Times New Roman" w:eastAsia="Times New Roman"/>
+          <w:sz w:val="24"/>
+        </w:rPr>
+        <w:t>2) Nội dung đã thực hiện</w:t>
+      </w:r>
+    </w:p>
+    <w:p>
+      <w:r>
+        <w:rPr>
+          <w:rFonts w:ascii="Times New Roman" w:hAnsi="Times New Roman" w:eastAsia="Times New Roman"/>
+          <w:sz w:val="24"/>
+        </w:rPr>
+        <w:t>- `orders`: bổ sung helper `recalculate_totals`, tự động tính `discount/sub_total` cho `OrderDetail`, validate dữ liệu đầu vào, thêm `__str__`/`ordering`.</w:t>
+      </w:r>
+    </w:p>
+    <w:p>
+      <w:r>
+        <w:rPr>
+          <w:rFonts w:ascii="Times New Roman" w:hAnsi="Times New Roman" w:eastAsia="Times New Roman"/>
+          <w:sz w:val="24"/>
+        </w:rPr>
+        <w:t>- `products`: bổ sung `discounted_price`, `formatted_price`, validate giá/tồn kho/% giảm.</w:t>
+      </w:r>
+    </w:p>
+    <w:p>
+      <w:r>
+        <w:rPr>
+          <w:rFonts w:ascii="Times New Roman" w:hAnsi="Times New Roman" w:eastAsia="Times New Roman"/>
+          <w:sz w:val="24"/>
+        </w:rPr>
+        <w:t>- `CartItem`: tự động tính `discount_amount`, `sub_total`.</w:t>
+      </w:r>
+    </w:p>
+    <w:p>
+      <w:r>
+        <w:rPr>
+          <w:rFonts w:ascii="Times New Roman" w:hAnsi="Times New Roman" w:eastAsia="Times New Roman"/>
+          <w:sz w:val="24"/>
+        </w:rPr>
+        <w:t>- `Cart`: helper `total_items`, `total_amount`.</w:t>
+      </w:r>
+    </w:p>
+    <w:p>
+      <w:r>
+        <w:rPr>
+          <w:rFonts w:ascii="Times New Roman" w:hAnsi="Times New Roman" w:eastAsia="Times New Roman"/>
+          <w:sz w:val="24"/>
+        </w:rPr>
+        <w:t>- `DiscountCode`: bổ sung `is_valid`, `mark_as_used`.</w:t>
+      </w:r>
+    </w:p>
+    <w:p>
+      <w:r>
+        <w:rPr>
+          <w:rFonts w:ascii="Times New Roman" w:hAnsi="Times New Roman" w:eastAsia="Times New Roman"/>
+          <w:sz w:val="24"/>
+        </w:rPr>
+        <w:t>3) Kết quả test</w:t>
+      </w:r>
+    </w:p>
+    <w:p>
+      <w:r>
+        <w:rPr>
+          <w:rFonts w:ascii="Times New Roman" w:hAnsi="Times New Roman" w:eastAsia="Times New Roman"/>
+          <w:sz w:val="24"/>
+        </w:rPr>
+        <w:t>- `python manage.py test orders`: 7/7 PASS.</w:t>
+      </w:r>
+    </w:p>
+    <w:p>
+      <w:r>
+        <w:rPr>
+          <w:rFonts w:ascii="Times New Roman" w:hAnsi="Times New Roman" w:eastAsia="Times New Roman"/>
+          <w:sz w:val="24"/>
+        </w:rPr>
+        <w:t>- `python manage.py test products`: 9/9 PASS.</w:t>
+      </w:r>
+    </w:p>
+    <w:p>
+      <w:r>
+        <w:rPr>
+          <w:rFonts w:ascii="Times New Roman" w:hAnsi="Times New Roman" w:eastAsia="Times New Roman"/>
+          <w:sz w:val="24"/>
+        </w:rPr>
+        <w:t>- `python manage.py test`: 29/29 PASS.</w:t>
       </w:r>
     </w:p>
     <w:p/>
     <w:p>
       <w:r>
-        <w:t>Bao cao bo sung 5: CAP_NHAT_2026-04-14</w:t>
+        <w:rPr>
+          <w:rFonts w:ascii="Times New Roman" w:hAnsi="Times New Roman" w:eastAsia="Times New Roman"/>
+          <w:sz w:val="24"/>
+        </w:rPr>
+        <w:t>IV. BÁO CÁO CẬP NHẬT TỪ 10/04/2026 ĐẾN 13/04/2026</w:t>
       </w:r>
     </w:p>
     <w:p>
       <w:r>
-        <w:t>BAO CAO CAP NHAT NGAY 14/04/2026</w:t>
+        <w:rPr>
+          <w:rFonts w:ascii="Times New Roman" w:hAnsi="Times New Roman" w:eastAsia="Times New Roman"/>
+          <w:sz w:val="24"/>
+        </w:rPr>
+        <w:t>1) Mục tiêu</w:t>
       </w:r>
     </w:p>
     <w:p>
       <w:r>
-        <w:t>Du an: Quan ly ban hang</w:t>
+        <w:rPr>
+          <w:rFonts w:ascii="Times New Roman" w:hAnsi="Times New Roman" w:eastAsia="Times New Roman"/>
+          <w:sz w:val="24"/>
+        </w:rPr>
+        <w:t>- Đồng bộ giao diện Home, Product Detail và các trang Admin.</w:t>
       </w:r>
     </w:p>
     <w:p>
       <w:r>
-        <w:t>Ngay cap nhat: 14/04/2026</w:t>
+        <w:rPr>
+          <w:rFonts w:ascii="Times New Roman" w:hAnsi="Times New Roman" w:eastAsia="Times New Roman"/>
+          <w:sz w:val="24"/>
+        </w:rPr>
+        <w:t>- Bổ sung phân quyền menu theo vai trò admin/customer.</w:t>
+      </w:r>
+    </w:p>
+    <w:p>
+      <w:r>
+        <w:rPr>
+          <w:rFonts w:ascii="Times New Roman" w:hAnsi="Times New Roman" w:eastAsia="Times New Roman"/>
+          <w:sz w:val="24"/>
+        </w:rPr>
+        <w:t>- Tạo trang Admin thêm sản phẩm và trang thống kê bán hàng dùng truy vấn SQL.</w:t>
+      </w:r>
+    </w:p>
+    <w:p>
+      <w:r>
+        <w:rPr>
+          <w:rFonts w:ascii="Times New Roman" w:hAnsi="Times New Roman" w:eastAsia="Times New Roman"/>
+          <w:sz w:val="24"/>
+        </w:rPr>
+        <w:t>2) Nội dung đã làm</w:t>
+      </w:r>
+    </w:p>
+    <w:p>
+      <w:r>
+        <w:rPr>
+          <w:rFonts w:ascii="Times New Roman" w:hAnsi="Times New Roman" w:eastAsia="Times New Roman"/>
+          <w:sz w:val="24"/>
+        </w:rPr>
+        <w:t>- Khôi phục sidebar Phân loại + Bộ lọc trên Home, render động từ backend context.</w:t>
+      </w:r>
+    </w:p>
+    <w:p>
+      <w:r>
+        <w:rPr>
+          <w:rFonts w:ascii="Times New Roman" w:hAnsi="Times New Roman" w:eastAsia="Times New Roman"/>
+          <w:sz w:val="24"/>
+        </w:rPr>
+        <w:t>- Tạo `admin_product_create.html` với form thêm sản phẩm (thể loại, ảnh, giá, số lượng, mô tả...).</w:t>
+      </w:r>
+    </w:p>
+    <w:p>
+      <w:r>
+        <w:rPr>
+          <w:rFonts w:ascii="Times New Roman" w:hAnsi="Times New Roman" w:eastAsia="Times New Roman"/>
+          <w:sz w:val="24"/>
+        </w:rPr>
+        <w:t>- Tạo `admin_sales_stats.html` hiển thị thống kê: số người dùng, số đơn, doanh thu, tổng sản phẩm.</w:t>
+      </w:r>
+    </w:p>
+    <w:p>
+      <w:r>
+        <w:rPr>
+          <w:rFonts w:ascii="Times New Roman" w:hAnsi="Times New Roman" w:eastAsia="Times New Roman"/>
+          <w:sz w:val="24"/>
+        </w:rPr>
+        <w:t>- Bổ sung route `/admin/thong-ke-ban-hang/` chỉ cho admin.</w:t>
+      </w:r>
+    </w:p>
+    <w:p>
+      <w:r>
+        <w:rPr>
+          <w:rFonts w:ascii="Times New Roman" w:hAnsi="Times New Roman" w:eastAsia="Times New Roman"/>
+          <w:sz w:val="24"/>
+        </w:rPr>
+        <w:t>- Cập nhật menu theo role: admin thấy m?c qu?n tr?, customer thấy Ví tiền + Giỏ hàng.</w:t>
+      </w:r>
+    </w:p>
+    <w:p>
+      <w:r>
+        <w:rPr>
+          <w:rFonts w:ascii="Times New Roman" w:hAnsi="Times New Roman" w:eastAsia="Times New Roman"/>
+          <w:sz w:val="24"/>
+        </w:rPr>
+        <w:t>- Cập nhật route `san-pham/preview` và `san-pham/&lt;id&gt;` đồng bộ giao diện.</w:t>
+      </w:r>
+    </w:p>
+    <w:p>
+      <w:r>
+        <w:rPr>
+          <w:rFonts w:ascii="Times New Roman" w:hAnsi="Times New Roman" w:eastAsia="Times New Roman"/>
+          <w:sz w:val="24"/>
+        </w:rPr>
+        <w:t>3) Kết quả kiểm tra</w:t>
+      </w:r>
+    </w:p>
+    <w:p>
+      <w:r>
+        <w:rPr>
+          <w:rFonts w:ascii="Times New Roman" w:hAnsi="Times New Roman" w:eastAsia="Times New Roman"/>
+          <w:sz w:val="24"/>
+        </w:rPr>
+        <w:t>- `python manage.py check`: PASS.</w:t>
+      </w:r>
+    </w:p>
+    <w:p>
+      <w:r>
+        <w:rPr>
+          <w:rFonts w:ascii="Times New Roman" w:hAnsi="Times New Roman" w:eastAsia="Times New Roman"/>
+          <w:sz w:val="24"/>
+        </w:rPr>
+        <w:t>- Route admin thêm sản phẩm truy cập được.</w:t>
+      </w:r>
+    </w:p>
+    <w:p>
+      <w:r>
+        <w:rPr>
+          <w:rFonts w:ascii="Times New Roman" w:hAnsi="Times New Roman" w:eastAsia="Times New Roman"/>
+          <w:sz w:val="24"/>
+        </w:rPr>
+        <w:t>- Route thống kê bán hàng hoạt động đúng phân quyền.</w:t>
       </w:r>
     </w:p>
     <w:p/>
     <w:p>
       <w:r>
-        <w:t>1. Muc tieu cap nhat</w:t>
+        <w:rPr>
+          <w:rFonts w:ascii="Times New Roman" w:hAnsi="Times New Roman" w:eastAsia="Times New Roman"/>
+          <w:sz w:val="24"/>
+        </w:rPr>
+        <w:t>V. BÁO CÁO CẬP NHẬT NGÀY 14/04/2026</w:t>
       </w:r>
     </w:p>
     <w:p>
       <w:r>
-        <w:t>Hoan thien luong yeu cau nap tien giua customer va admin.</w:t>
+        <w:rPr>
+          <w:rFonts w:ascii="Times New Roman" w:hAnsi="Times New Roman" w:eastAsia="Times New Roman"/>
+          <w:sz w:val="24"/>
+        </w:rPr>
+        <w:t>1) Mục tiêu</w:t>
       </w:r>
     </w:p>
     <w:p>
       <w:r>
-        <w:t>Bo sung giao dien thong ke ban hang cho admin va cap nhat menu theo phan quyen role.</w:t>
+        <w:rPr>
+          <w:rFonts w:ascii="Times New Roman" w:hAnsi="Times New Roman" w:eastAsia="Times New Roman"/>
+          <w:sz w:val="24"/>
+        </w:rPr>
+        <w:t>- Hoàn thiện luồng yêu cầu nạp tiền giữa customer và admin.</w:t>
+      </w:r>
+    </w:p>
+    <w:p>
+      <w:r>
+        <w:rPr>
+          <w:rFonts w:ascii="Times New Roman" w:hAnsi="Times New Roman" w:eastAsia="Times New Roman"/>
+          <w:sz w:val="24"/>
+        </w:rPr>
+        <w:t>- Bổ sung giao diện thống kê bán hàng cho admin và cập nhật menu theo role.</w:t>
+      </w:r>
+    </w:p>
+    <w:p>
+      <w:r>
+        <w:rPr>
+          <w:rFonts w:ascii="Times New Roman" w:hAnsi="Times New Roman" w:eastAsia="Times New Roman"/>
+          <w:sz w:val="24"/>
+        </w:rPr>
+        <w:t>2) Nội dung đã thực hiện</w:t>
+      </w:r>
+    </w:p>
+    <w:p>
+      <w:r>
+        <w:rPr>
+          <w:rFonts w:ascii="Times New Roman" w:hAnsi="Times New Roman" w:eastAsia="Times New Roman"/>
+          <w:sz w:val="24"/>
+        </w:rPr>
+        <w:t>- Tạo `topup_request.html` cho customer gửi yêu cầu nạp tiền.</w:t>
+      </w:r>
+    </w:p>
+    <w:p>
+      <w:r>
+        <w:rPr>
+          <w:rFonts w:ascii="Times New Roman" w:hAnsi="Times New Roman" w:eastAsia="Times New Roman"/>
+          <w:sz w:val="24"/>
+        </w:rPr>
+        <w:t>- Tạo `topup_admin_review.html` cho admin duyệt/từ chối yêu cầu nạp.</w:t>
+      </w:r>
+    </w:p>
+    <w:p>
+      <w:r>
+        <w:rPr>
+          <w:rFonts w:ascii="Times New Roman" w:hAnsi="Times New Roman" w:eastAsia="Times New Roman"/>
+          <w:sz w:val="24"/>
+        </w:rPr>
+        <w:t>- Cập nhật backend xử lý nghiệp vụ nạp tiền, cộng số dư ví khi duyệt.</w:t>
+      </w:r>
+    </w:p>
+    <w:p>
+      <w:r>
+        <w:rPr>
+          <w:rFonts w:ascii="Times New Roman" w:hAnsi="Times New Roman" w:eastAsia="Times New Roman"/>
+          <w:sz w:val="24"/>
+        </w:rPr>
+        <w:t>- Bổ sung route `/nap-tien/` và `/admin/duyet-nap-tien/`.</w:t>
+      </w:r>
+    </w:p>
+    <w:p>
+      <w:r>
+        <w:rPr>
+          <w:rFonts w:ascii="Times New Roman" w:hAnsi="Times New Roman" w:eastAsia="Times New Roman"/>
+          <w:sz w:val="24"/>
+        </w:rPr>
+        <w:t>- Cập nhật menu trên các trang để điều hướng đúng theo vai trò.</w:t>
+      </w:r>
+    </w:p>
+    <w:p>
+      <w:r>
+        <w:rPr>
+          <w:rFonts w:ascii="Times New Roman" w:hAnsi="Times New Roman" w:eastAsia="Times New Roman"/>
+          <w:sz w:val="24"/>
+        </w:rPr>
+        <w:t>3) Kết quả</w:t>
+      </w:r>
+    </w:p>
+    <w:p>
+      <w:r>
+        <w:rPr>
+          <w:rFonts w:ascii="Times New Roman" w:hAnsi="Times New Roman" w:eastAsia="Times New Roman"/>
+          <w:sz w:val="24"/>
+        </w:rPr>
+        <w:t>- Customer gửi request và theo dõi trạng thái ngay trên giao diện.</w:t>
+      </w:r>
+    </w:p>
+    <w:p>
+      <w:r>
+        <w:rPr>
+          <w:rFonts w:ascii="Times New Roman" w:hAnsi="Times New Roman" w:eastAsia="Times New Roman"/>
+          <w:sz w:val="24"/>
+        </w:rPr>
+        <w:t>- Admin duyệt nhanh request pending và theo dõi lịch sử đã xử lý.</w:t>
+      </w:r>
+    </w:p>
+    <w:p>
+      <w:r>
+        <w:rPr>
+          <w:rFonts w:ascii="Times New Roman" w:hAnsi="Times New Roman" w:eastAsia="Times New Roman"/>
+          <w:sz w:val="24"/>
+        </w:rPr>
+        <w:t>- Ví được cập nhật tự động khi request được chấp nhận.</w:t>
       </w:r>
     </w:p>
     <w:p/>
     <w:p>
       <w:r>
-        <w:t>2. Noi dung da thuc hien</w:t>
+        <w:rPr>
+          <w:rFonts w:ascii="Times New Roman" w:hAnsi="Times New Roman" w:eastAsia="Times New Roman"/>
+          <w:sz w:val="24"/>
+        </w:rPr>
+        <w:t>VI. GIẢI THÍCH DEV A - LUỒNG CART + BUY_NOW_PREPARE (TỔNG HỢP CÓ DẤU)</w:t>
       </w:r>
     </w:p>
     <w:p>
       <w:r>
-        <w:t>Tao trang topup_request.html cho customer gui yeu cau nap tien gom so tien (VND) va ly do nap.</w:t>
+        <w:rPr>
+          <w:rFonts w:ascii="Times New Roman" w:hAnsi="Times New Roman" w:eastAsia="Times New Roman"/>
+          <w:sz w:val="24"/>
+        </w:rPr>
+        <w:t>1) Mục tiêu thay đổi</w:t>
       </w:r>
     </w:p>
     <w:p>
       <w:r>
-        <w:t>Tao trang topup_admin_review.html cho admin xu ly yeu cau nap tien voi 2 hanh dong: chap nhan hoac tu choi.</w:t>
+        <w:rPr>
+          <w:rFonts w:ascii="Times New Roman" w:hAnsi="Times New Roman" w:eastAsia="Times New Roman"/>
+          <w:sz w:val="24"/>
+        </w:rPr>
+        <w:t>- Dựng nền route/view contract cho CART + BUY_NOW_PREPARE.</w:t>
       </w:r>
     </w:p>
     <w:p>
       <w:r>
-        <w:t>Cap nhat backend xu ly nghiep vu nap tien: tao request, doi trang thai request, cong so du vi khi chap nhan.</w:t>
+        <w:rPr>
+          <w:rFonts w:ascii="Times New Roman" w:hAnsi="Times New Roman" w:eastAsia="Times New Roman"/>
+          <w:sz w:val="24"/>
+        </w:rPr>
+        <w:t>- Chuẩn hóa permission guard (bắt buộc login, chặn staff).</w:t>
       </w:r>
     </w:p>
     <w:p>
       <w:r>
-        <w:t>Bo sung route: /nap-tien/ va /admin/duyet-nap-tien/.</w:t>
+        <w:rPr>
+          <w:rFonts w:ascii="Times New Roman" w:hAnsi="Times New Roman" w:eastAsia="Times New Roman"/>
+          <w:sz w:val="24"/>
+        </w:rPr>
+        <w:t>- Bổ sung smoke test route + permission.</w:t>
       </w:r>
     </w:p>
     <w:p>
       <w:r>
-        <w:t>Cap nhat menu home/product_detail/admin pages de dieu huong dung theo role (admin/customer).</w:t>
+        <w:rPr>
+          <w:rFonts w:ascii="Times New Roman" w:hAnsi="Times New Roman" w:eastAsia="Times New Roman"/>
+          <w:sz w:val="24"/>
+        </w:rPr>
+        <w:t>2) Các tệp liên quan</w:t>
       </w:r>
     </w:p>
     <w:p>
       <w:r>
-        <w:t>Them trang admin_sales_stats va cau hinh truy van SQL rieng admin_sales_stats.sql.</w:t>
+        <w:rPr>
+          <w:rFonts w:ascii="Times New Roman" w:hAnsi="Times New Roman" w:eastAsia="Times New Roman"/>
+          <w:sz w:val="24"/>
+        </w:rPr>
+        <w:t>- `orders/urls.py`: khai báo route cho luồng giỏ hàng/mua ngay.</w:t>
+      </w:r>
+    </w:p>
+    <w:p>
+      <w:r>
+        <w:rPr>
+          <w:rFonts w:ascii="Times New Roman" w:hAnsi="Times New Roman" w:eastAsia="Times New Roman"/>
+          <w:sz w:val="24"/>
+        </w:rPr>
+        <w:t>- `orders/views.py`: triển khai endpoint JSON theo contract.</w:t>
+      </w:r>
+    </w:p>
+    <w:p>
+      <w:r>
+        <w:rPr>
+          <w:rFonts w:ascii="Times New Roman" w:hAnsi="Times New Roman" w:eastAsia="Times New Roman"/>
+          <w:sz w:val="24"/>
+        </w:rPr>
+        <w:t>- `orders/tests.py`: bổ sung smoke test.</w:t>
+      </w:r>
+    </w:p>
+    <w:p>
+      <w:r>
+        <w:rPr>
+          <w:rFonts w:ascii="Times New Roman" w:hAnsi="Times New Roman" w:eastAsia="Times New Roman"/>
+          <w:sz w:val="24"/>
+        </w:rPr>
+        <w:t>- `docs/checkout_contract.md`: chuẩn hóa payload checkout.</w:t>
+      </w:r>
+    </w:p>
+    <w:p>
+      <w:r>
+        <w:rPr>
+          <w:rFonts w:ascii="Times New Roman" w:hAnsi="Times New Roman" w:eastAsia="Times New Roman"/>
+          <w:sz w:val="24"/>
+        </w:rPr>
+        <w:t>3) Kết luận</w:t>
+      </w:r>
+    </w:p>
+    <w:p>
+      <w:r>
+        <w:rPr>
+          <w:rFonts w:ascii="Times New Roman" w:hAnsi="Times New Roman" w:eastAsia="Times New Roman"/>
+          <w:sz w:val="24"/>
+        </w:rPr>
+        <w:t>- Luồng CART + BUY_NOW_PREPARE đã có nền kỹ thuật ổn định, dễ mở rộng checkout thực tế.</w:t>
       </w:r>
     </w:p>
     <w:p/>
     <w:p>
       <w:r>
-        <w:t>3. Ket qua dat duoc</w:t>
+        <w:rPr>
+          <w:rFonts w:ascii="Times New Roman" w:hAnsi="Times New Roman" w:eastAsia="Times New Roman"/>
+          <w:sz w:val="24"/>
+        </w:rPr>
+        <w:t>VII. BÁO CÁO THỰC HIỆN YÊU CẦU 1 (29/04/2026)</w:t>
       </w:r>
     </w:p>
     <w:p>
       <w:r>
-        <w:t>Customer co the gui request nap tien va xem lich su/trang thai request ngay tren giao dien.</w:t>
+        <w:rPr>
+          <w:rFonts w:ascii="Times New Roman" w:hAnsi="Times New Roman" w:eastAsia="Times New Roman"/>
+          <w:sz w:val="24"/>
+        </w:rPr>
+        <w:t>Yêu cầu: tạo/chuẩn hóa route `cart_checkout`, `buy_now_checkout`, `orders_list`, `order_detail`, `wallet_view`.</w:t>
       </w:r>
     </w:p>
     <w:p>
       <w:r>
-        <w:t>Admin co the duyet nhanh tung request dang cho va theo doi lich su request da xu ly.</w:t>
+        <w:rPr>
+          <w:rFonts w:ascii="Times New Roman" w:hAnsi="Times New Roman" w:eastAsia="Times New Roman"/>
+          <w:sz w:val="24"/>
+        </w:rPr>
+        <w:t>1) Công việc đã làm</w:t>
       </w:r>
     </w:p>
     <w:p>
       <w:r>
-        <w:t>Du lieu vi tien duoc cap nhat tu dong khi request duoc chap nhan.</w:t>
+        <w:rPr>
+          <w:rFonts w:ascii="Times New Roman" w:hAnsi="Times New Roman" w:eastAsia="Times New Roman"/>
+          <w:sz w:val="24"/>
+        </w:rPr>
+        <w:t>- Thêm đủ 5 route mới trong `orders/urls.py`.</w:t>
       </w:r>
     </w:p>
     <w:p>
       <w:r>
-        <w:t>Menu he thong da hien thi theo role, tranh hien cac muc khong phu hop voi admin/customer.</w:t>
+        <w:rPr>
+          <w:rFonts w:ascii="Times New Roman" w:hAnsi="Times New Roman" w:eastAsia="Times New Roman"/>
+          <w:sz w:val="24"/>
+        </w:rPr>
+        <w:t>- Tạo view khung tương ứng trong `orders/views.py` để route có thể reverse/truy cập ngay.</w:t>
+      </w:r>
+    </w:p>
+    <w:p>
+      <w:r>
+        <w:rPr>
+          <w:rFonts w:ascii="Times New Roman" w:hAnsi="Times New Roman" w:eastAsia="Times New Roman"/>
+          <w:sz w:val="24"/>
+        </w:rPr>
+        <w:t>- Giữ nguyên route cũ để không phá vỡ contract hiện tại.</w:t>
+      </w:r>
+    </w:p>
+    <w:p>
+      <w:r>
+        <w:rPr>
+          <w:rFonts w:ascii="Times New Roman" w:hAnsi="Times New Roman" w:eastAsia="Times New Roman"/>
+          <w:sz w:val="24"/>
+        </w:rPr>
+        <w:t>- Không sửa `banhang/urls.py` vì không bắt buộc.</w:t>
+      </w:r>
+    </w:p>
+    <w:p>
+      <w:r>
+        <w:rPr>
+          <w:rFonts w:ascii="Times New Roman" w:hAnsi="Times New Roman" w:eastAsia="Times New Roman"/>
+          <w:sz w:val="24"/>
+        </w:rPr>
+        <w:t>2) Danh sách route mới</w:t>
+      </w:r>
+    </w:p>
+    <w:p>
+      <w:r>
+        <w:rPr>
+          <w:rFonts w:ascii="Times New Roman" w:hAnsi="Times New Roman" w:eastAsia="Times New Roman"/>
+          <w:sz w:val="24"/>
+        </w:rPr>
+        <w:t>- `cart_checkout` -&gt; `/thanh-toan/gio-hang/`</w:t>
+      </w:r>
+    </w:p>
+    <w:p>
+      <w:r>
+        <w:rPr>
+          <w:rFonts w:ascii="Times New Roman" w:hAnsi="Times New Roman" w:eastAsia="Times New Roman"/>
+          <w:sz w:val="24"/>
+        </w:rPr>
+        <w:t>- `buy_now_checkout` -&gt; `/thanh-toan/mua-ngay/`</w:t>
+      </w:r>
+    </w:p>
+    <w:p>
+      <w:r>
+        <w:rPr>
+          <w:rFonts w:ascii="Times New Roman" w:hAnsi="Times New Roman" w:eastAsia="Times New Roman"/>
+          <w:sz w:val="24"/>
+        </w:rPr>
+        <w:t>- `orders_list` -&gt; `/don-hang/`</w:t>
+      </w:r>
+    </w:p>
+    <w:p>
+      <w:r>
+        <w:rPr>
+          <w:rFonts w:ascii="Times New Roman" w:hAnsi="Times New Roman" w:eastAsia="Times New Roman"/>
+          <w:sz w:val="24"/>
+        </w:rPr>
+        <w:t>- `order_detail` -&gt; `/don-hang/&lt;int:order_id&gt;/`</w:t>
+      </w:r>
+    </w:p>
+    <w:p>
+      <w:r>
+        <w:rPr>
+          <w:rFonts w:ascii="Times New Roman" w:hAnsi="Times New Roman" w:eastAsia="Times New Roman"/>
+          <w:sz w:val="24"/>
+        </w:rPr>
+        <w:t>- `wallet_view` -&gt; `/vi/`</w:t>
+      </w:r>
+    </w:p>
+    <w:p>
+      <w:r>
+        <w:rPr>
+          <w:rFonts w:ascii="Times New Roman" w:hAnsi="Times New Roman" w:eastAsia="Times New Roman"/>
+          <w:sz w:val="24"/>
+        </w:rPr>
+        <w:t>3) Tệp đã sửa</w:t>
+      </w:r>
+    </w:p>
+    <w:p>
+      <w:r>
+        <w:rPr>
+          <w:rFonts w:ascii="Times New Roman" w:hAnsi="Times New Roman" w:eastAsia="Times New Roman"/>
+          <w:sz w:val="24"/>
+        </w:rPr>
+        <w:t>- `orders/urls.py`</w:t>
+      </w:r>
+    </w:p>
+    <w:p>
+      <w:r>
+        <w:rPr>
+          <w:rFonts w:ascii="Times New Roman" w:hAnsi="Times New Roman" w:eastAsia="Times New Roman"/>
+          <w:sz w:val="24"/>
+        </w:rPr>
+        <w:t>- `orders/views.py`</w:t>
+      </w:r>
+    </w:p>
+    <w:p>
+      <w:r>
+        <w:rPr>
+          <w:rFonts w:ascii="Times New Roman" w:hAnsi="Times New Roman" w:eastAsia="Times New Roman"/>
+          <w:sz w:val="24"/>
+        </w:rPr>
+        <w:t>4) Kết quả test</w:t>
+      </w:r>
+    </w:p>
+    <w:p>
+      <w:r>
+        <w:rPr>
+          <w:rFonts w:ascii="Times New Roman" w:hAnsi="Times New Roman" w:eastAsia="Times New Roman"/>
+          <w:sz w:val="24"/>
+        </w:rPr>
+        <w:t>- Chạy `./.venv/Scripts/python manage.py test orders` -&gt; PASS (11/11 tests).</w:t>
       </w:r>
     </w:p>
     <w:p/>
     <w:p>
       <w:r>
-        <w:t>4. File thay doi chinh</w:t>
+        <w:rPr>
+          <w:rFonts w:ascii="Times New Roman" w:hAnsi="Times New Roman" w:eastAsia="Times New Roman"/>
+          <w:sz w:val="24"/>
+        </w:rPr>
+        <w:t>VIII. TỔNG KẾT</w:t>
       </w:r>
     </w:p>
     <w:p>
       <w:r>
-        <w:t>banhang/urls.py</w:t>
+        <w:rPr>
+          <w:rFonts w:ascii="Times New Roman" w:hAnsi="Times New Roman" w:eastAsia="Times New Roman"/>
+          <w:sz w:val="24"/>
+        </w:rPr>
+        <w:t>- Toàn bộ nội dung trong file đã được chuẩn hóa sang tiếng Việt có dấu.</w:t>
       </w:r>
     </w:p>
     <w:p>
       <w:r>
-        <w:t>templates/topup_request.html</w:t>
+        <w:rPr>
+          <w:rFonts w:ascii="Times New Roman" w:hAnsi="Times New Roman" w:eastAsia="Times New Roman"/>
+          <w:sz w:val="24"/>
+        </w:rPr>
+        <w:t>- Nội dung giữ nguyên ý nghĩa báo cáo, tổ chức lại theo timeline để dễ tra cứu.</w:t>
+      </w:r>
+    </w:p>
+    <w:p/>
+    <w:p/>
+    <w:p>
+      <w:r>
+        <w:rPr>
+          <w:rFonts w:ascii="Times New Roman" w:hAnsi="Times New Roman" w:eastAsia="Times New Roman"/>
+          <w:sz w:val="24"/>
+        </w:rPr>
+        <w:t>IX. BÁO CÁO CẬP NHẬT NGÀY 03/05/2026 (TỪ THỜI ĐIỂM LẤY CODE TỪ GITHUB)</w:t>
       </w:r>
     </w:p>
     <w:p>
       <w:r>
-        <w:t>templates/topup_admin_review.html</w:t>
+        <w:rPr>
+          <w:rFonts w:ascii="Times New Roman" w:hAnsi="Times New Roman" w:eastAsia="Times New Roman"/>
+          <w:sz w:val="24"/>
+        </w:rPr>
+        <w:t>1) HẠNG MỤC ĐÃ THỰC HIỆN</w:t>
       </w:r>
     </w:p>
     <w:p>
       <w:r>
-        <w:t>templates/home.html</w:t>
+        <w:rPr>
+          <w:rFonts w:ascii="Times New Roman" w:hAnsi="Times New Roman" w:eastAsia="Times New Roman"/>
+          <w:sz w:val="24"/>
+        </w:rPr>
+        <w:t>- Chuẩn hóa và bổ sung đủ 5 route trang nghiệp vụ mua hàng: cart_checkout, buy_now_checkout, orders_list, order_detail, wallet_view.</w:t>
       </w:r>
     </w:p>
     <w:p>
       <w:r>
-        <w:t>templates/product_detail.html</w:t>
+        <w:rPr>
+          <w:rFonts w:ascii="Times New Roman" w:hAnsi="Times New Roman" w:eastAsia="Times New Roman"/>
+          <w:sz w:val="24"/>
+        </w:rPr>
+        <w:t>- Tạo khung view render HTML cho checkout giỏ hàng, checkout mua ngay, danh sách đơn hàng, chi tiết đơn hàng và ví tiền.</w:t>
       </w:r>
     </w:p>
     <w:p>
       <w:r>
-        <w:t>templates/admin_product_create.html</w:t>
+        <w:rPr>
+          <w:rFonts w:ascii="Times New Roman" w:hAnsi="Times New Roman" w:eastAsia="Times New Roman"/>
+          <w:sz w:val="24"/>
+        </w:rPr>
+        <w:t>- Tạo mới bộ template khung cho các trang trên để frontend có điểm bám phát triển tiếp.</w:t>
       </w:r>
     </w:p>
     <w:p>
       <w:r>
-        <w:t>templates/admin_sales_stats.html</w:t>
+        <w:rPr>
+          <w:rFonts w:ascii="Times New Roman" w:hAnsi="Times New Roman" w:eastAsia="Times New Roman"/>
+          <w:sz w:val="24"/>
+        </w:rPr>
+        <w:t>- Cập nhật điều hướng, loại bỏ link placeholder cho các mục Giỏ hàng/Ví tiền/Đơn hàng tại các trang user liên quan.</w:t>
       </w:r>
     </w:p>
     <w:p>
       <w:r>
-        <w:t>sql/admin_sales_stats.sql</w:t>
-      </w:r>
-    </w:p>
-    <w:p/>
-    <w:p>
-      <w:r>
-        <w:t>5. Kiem tra</w:t>
+        <w:rPr>
+          <w:rFonts w:ascii="Times New Roman" w:hAnsi="Times New Roman" w:eastAsia="Times New Roman"/>
+          <w:sz w:val="24"/>
+        </w:rPr>
+        <w:t>- Thêm form nhập discount_code ở checkout và cấu hình submit đúng route checkout tương ứng.</w:t>
       </w:r>
     </w:p>
     <w:p>
       <w:r>
-        <w:t>python manage.py check: pass.</w:t>
+        <w:rPr>
+          <w:rFonts w:ascii="Times New Roman" w:hAnsi="Times New Roman" w:eastAsia="Times New Roman"/>
+          <w:sz w:val="24"/>
+        </w:rPr>
+        <w:t>- Bổ sung smoke test cho nhóm trang mới: kiểm tra login-required và render thành công với customer.</w:t>
       </w:r>
     </w:p>
     <w:p>
       <w:r>
-        <w:t>Kiem tra luong customer gui request -&gt; admin chap nhan -&gt; vi duoc cong: pass.</w:t>
+        <w:rPr>
+          <w:rFonts w:ascii="Times New Roman" w:hAnsi="Times New Roman" w:eastAsia="Times New Roman"/>
+          <w:sz w:val="24"/>
+        </w:rPr>
+        <w:t>- Đồng bộ thứ tự menu user theo chuẩn: Trang chủ -&gt; Yêu cầu nạp tiền -&gt; Ví tiền -&gt; Giỏ hàng -&gt; Đơn hàng.</w:t>
       </w:r>
     </w:p>
     <w:p>
       <w:r>
-        <w:t>Kiem tra phan quyen route nap tien va menu theo role: pass.</w:t>
+        <w:rPr>
+          <w:rFonts w:ascii="Times New Roman" w:hAnsi="Times New Roman" w:eastAsia="Times New Roman"/>
+          <w:sz w:val="24"/>
+        </w:rPr>
+        <w:t>- Xử lý migration còn thiếu của app orders: đã apply orders.0002_alter_order_options_alter_orderdetail_options.</w:t>
       </w:r>
     </w:p>
     <w:p>
       <w:r>
-        <w:t/>
+        <w:rPr>
+          <w:rFonts w:ascii="Times New Roman" w:hAnsi="Times New Roman" w:eastAsia="Times New Roman"/>
+          <w:sz w:val="24"/>
+        </w:rPr>
+        <w:t>2) FILE MỚI THÊM (NEW FILES)</w:t>
       </w:r>
     </w:p>
     <w:p>
       <w:r>
-        <w:t>Bao cao bo sung 6: CAP_NHAT_COMMIT_2026-04-14</w:t>
+        <w:rPr>
+          <w:rFonts w:ascii="Times New Roman" w:hAnsi="Times New Roman" w:eastAsia="Times New Roman"/>
+          <w:sz w:val="24"/>
+        </w:rPr>
+        <w:t>- templates/checkout_cart.html: Trang checkout từ giỏ hàng; hiển thị item đã chọn, tổng tạm tính và form discount_code.</w:t>
       </w:r>
     </w:p>
     <w:p>
       <w:r>
-        <w:t>BAO CAO BO SUNG CHO LAN CAP NHAT TAI LIEU</w:t>
+        <w:rPr>
+          <w:rFonts w:ascii="Times New Roman" w:hAnsi="Times New Roman" w:eastAsia="Times New Roman"/>
+          <w:sz w:val="24"/>
+        </w:rPr>
+        <w:t>- templates/checkout_buy_now.html: Trang checkout mua ngay; nhận product_id/quantity qua query, preview dữ liệu và form discount_code.</w:t>
       </w:r>
     </w:p>
     <w:p>
       <w:r>
-        <w:t>Du an: Quan ly ban hang</w:t>
+        <w:rPr>
+          <w:rFonts w:ascii="Times New Roman" w:hAnsi="Times New Roman" w:eastAsia="Times New Roman"/>
+          <w:sz w:val="24"/>
+        </w:rPr>
+        <w:t>- templates/orders_list.html: Trang danh sách đơn hàng của user; hiển thị trạng thái, tổng tiền và link đi vào chi tiết đơn.</w:t>
       </w:r>
     </w:p>
     <w:p>
       <w:r>
-        <w:t>Ngay cap nhat: 14/04/2026</w:t>
+        <w:rPr>
+          <w:rFonts w:ascii="Times New Roman" w:hAnsi="Times New Roman" w:eastAsia="Times New Roman"/>
+          <w:sz w:val="24"/>
+        </w:rPr>
+        <w:t>- templates/order_detail.html: Trang chi tiết đơn hàng; hiển thị các dòng sản phẩm, mã giảm giá, tạm tính, giảm giá và tổng thanh toán.</w:t>
       </w:r>
     </w:p>
     <w:p>
       <w:r>
-        <w:t>1. Muc tieu</w:t>
+        <w:rPr>
+          <w:rFonts w:ascii="Times New Roman" w:hAnsi="Times New Roman" w:eastAsia="Times New Roman"/>
+          <w:sz w:val="24"/>
+        </w:rPr>
+        <w:t>- templates/wallet_view.html: Trang ví tiền; hiển thị số dư và lịch sử yêu cầu nạp tiền gần đây.</w:t>
       </w:r>
     </w:p>
     <w:p>
       <w:r>
-        <w:t>Cap nhat tai lieu bao cao tong hop vao file DOCX va chot lich su thay doi tren git.</w:t>
+        <w:rPr>
+          <w:rFonts w:ascii="Times New Roman" w:hAnsi="Times New Roman" w:eastAsia="Times New Roman"/>
+          <w:sz w:val="24"/>
+        </w:rPr>
+        <w:t>- templates/partials/user_quick_menu.html: Partial menu dùng chung cho cụm trang checkout/đơn/ví để tránh lệch menu giữa các trang.</w:t>
       </w:r>
     </w:p>
     <w:p>
       <w:r>
-        <w:t>2. Noi dung thuc hien</w:t>
+        <w:rPr>
+          <w:rFonts w:ascii="Times New Roman" w:hAnsi="Times New Roman" w:eastAsia="Times New Roman"/>
+          <w:sz w:val="24"/>
+        </w:rPr>
+        <w:t>3) FILE ĐÃ SỬA (MODIFIED FILES)</w:t>
       </w:r>
     </w:p>
     <w:p>
       <w:r>
-        <w:t>- Bo sung muc bao cao moi vao cuoi tai lieu BAO_CAO_TONG_HOP.docx.</w:t>
+        <w:rPr>
+          <w:rFonts w:ascii="Times New Roman" w:hAnsi="Times New Roman" w:eastAsia="Times New Roman"/>
+          <w:sz w:val="24"/>
+        </w:rPr>
+        <w:t>- orders/urls.py: Bổ sung route cho 5 trang mới: cart_checkout, buy_now_checkout, orders_list, order_detail, wallet_view.</w:t>
       </w:r>
     </w:p>
     <w:p>
       <w:r>
-        <w:t>- Dong bo mo ta trang thai du an den ngay 14/04/2026.</w:t>
+        <w:rPr>
+          <w:rFonts w:ascii="Times New Roman" w:hAnsi="Times New Roman" w:eastAsia="Times New Roman"/>
+          <w:sz w:val="24"/>
+        </w:rPr>
+        <w:t>- orders/views.py: Thêm logic render cho 5 view mới; bổ sung context hiển thị checkout/order/wallet; thêm xử lý giữ discount_code_input.</w:t>
       </w:r>
     </w:p>
     <w:p>
       <w:r>
-        <w:t>- Chuan bi commit rieng cho file tai lieu de de truy vet lich su cap nhat.</w:t>
+        <w:rPr>
+          <w:rFonts w:ascii="Times New Roman" w:hAnsi="Times New Roman" w:eastAsia="Times New Roman"/>
+          <w:sz w:val="24"/>
+        </w:rPr>
+        <w:t>- orders/tests.py: Thêm lớp smoke test cho render/login-required của các trang mới và kiểm tra form discount_code submit đúng route.</w:t>
       </w:r>
     </w:p>
     <w:p>
       <w:r>
-        <w:t>3. File cap nhat</w:t>
+        <w:rPr>
+          <w:rFonts w:ascii="Times New Roman" w:hAnsi="Times New Roman" w:eastAsia="Times New Roman"/>
+          <w:sz w:val="24"/>
+        </w:rPr>
+        <w:t>- templates/topup_request.html: Cập nhật menu điều hướng user về link thật (không còn placeholder) và thêm link Đơn hàng.</w:t>
       </w:r>
     </w:p>
     <w:p>
       <w:r>
-        <w:t>docs/BAO_CAO_TONG_HOP.docx</w:t>
+        <w:rPr>
+          <w:rFonts w:ascii="Times New Roman" w:hAnsi="Times New Roman" w:eastAsia="Times New Roman"/>
+          <w:sz w:val="24"/>
+        </w:rPr>
+        <w:t>- templates/admin_product_create.html: Cập nhật menu khi user thường truy cập: thêm link Ví tiền/Giỏ hàng/Đơn hàng đúng route.</w:t>
       </w:r>
     </w:p>
     <w:p>
       <w:r>
-        <w:t>4. Ghi chu</w:t>
+        <w:rPr>
+          <w:rFonts w:ascii="Times New Roman" w:hAnsi="Times New Roman" w:eastAsia="Times New Roman"/>
+          <w:sz w:val="24"/>
+        </w:rPr>
+        <w:t>- templates/home.html: Đồng bộ menu user theo thứ tự chuẩn; thêm hiển thị section lịch sử/yêu cầu nạp tiền trên trang chủ theo role.</w:t>
       </w:r>
     </w:p>
     <w:p>
       <w:r>
-        <w:t>Noi dung bao cao duoc bo sung de phuc vu ban giao tai lieu va luu vet cong viec.</w:t>
+        <w:rPr>
+          <w:rFonts w:ascii="Times New Roman" w:hAnsi="Times New Roman" w:eastAsia="Times New Roman"/>
+          <w:sz w:val="24"/>
+        </w:rPr>
+        <w:t>- templates/product_detail.html: Đồng bộ menu user theo thứ tự chuẩn và sửa icon giỏ hàng sang link điều hướng thật.</w:t>
+      </w:r>
+    </w:p>
+    <w:p>
+      <w:r>
+        <w:rPr>
+          <w:rFonts w:ascii="Times New Roman" w:hAnsi="Times New Roman" w:eastAsia="Times New Roman"/>
+          <w:sz w:val="24"/>
+        </w:rPr>
+        <w:t>- banhang/urls.py: Bổ sung dữ liệu topup_section_title/topup_rows/has_topup_rows trong context của view home để render lịch sử/yêu cầu nạp tiền.</w:t>
+      </w:r>
+    </w:p>
+    <w:p>
+      <w:r>
+        <w:rPr>
+          <w:rFonts w:ascii="Times New Roman" w:hAnsi="Times New Roman" w:eastAsia="Times New Roman"/>
+          <w:sz w:val="24"/>
+        </w:rPr>
+        <w:t>- docs/gthichDevA.docx: Cập nhật thêm phần giải thích kỹ thuật (tài liệu giải trình nội bộ Dev A).</w:t>
+      </w:r>
+    </w:p>
+    <w:p>
+      <w:r>
+        <w:rPr>
+          <w:rFonts w:ascii="Times New Roman" w:hAnsi="Times New Roman" w:eastAsia="Times New Roman"/>
+          <w:sz w:val="24"/>
+        </w:rPr>
+        <w:t>- docs/BAO_CAO_TONG_HOP.docx: Bổ sung phần báo cáo tổng hợp mới này, cập nhật theo thay đổi thực tế sau khi pull code.</w:t>
+      </w:r>
+    </w:p>
+    <w:p>
+      <w:r>
+        <w:rPr>
+          <w:rFonts w:ascii="Times New Roman" w:hAnsi="Times New Roman" w:eastAsia="Times New Roman"/>
+          <w:sz w:val="24"/>
+        </w:rPr>
+        <w:t>4) TÌNH TRẠNG MIGRATION VÀ KIỂM THỬ</w:t>
+      </w:r>
+    </w:p>
+    <w:p>
+      <w:r>
+        <w:rPr>
+          <w:rFonts w:ascii="Times New Roman" w:hAnsi="Times New Roman" w:eastAsia="Times New Roman"/>
+          <w:sz w:val="24"/>
+        </w:rPr>
+        <w:t>- Đã chạy migrate: 'orders.0002_alter_order_options_alter_orderdetail_options' -&gt; OK.</w:t>
+      </w:r>
+    </w:p>
+    <w:p>
+      <w:r>
+        <w:rPr>
+          <w:rFonts w:ascii="Times New Roman" w:hAnsi="Times New Roman" w:eastAsia="Times New Roman"/>
+          <w:sz w:val="24"/>
+        </w:rPr>
+        <w:t>- Kiểm tra showmigrations orders: 0001 và 0002 đều ở trạng thái [X].</w:t>
+      </w:r>
+    </w:p>
+    <w:p>
+      <w:r>
+        <w:rPr>
+          <w:rFonts w:ascii="Times New Roman" w:hAnsi="Times New Roman" w:eastAsia="Times New Roman"/>
+          <w:sz w:val="24"/>
+        </w:rPr>
+        <w:t>- Chạy test app orders: 13/13 test PASS.</w:t>
+      </w:r>
+    </w:p>
+    <w:p>
+      <w:r>
+        <w:rPr>
+          <w:rFonts w:ascii="Times New Roman" w:hAnsi="Times New Roman" w:eastAsia="Times New Roman"/>
+          <w:sz w:val="24"/>
+        </w:rPr>
+        <w:t>5) GHI CHÚ PHẠM VI</w:t>
+      </w:r>
+    </w:p>
+    <w:p>
+      <w:r>
+        <w:rPr>
+          <w:rFonts w:ascii="Times New Roman" w:hAnsi="Times New Roman" w:eastAsia="Times New Roman"/>
+          <w:sz w:val="24"/>
+        </w:rPr>
+        <w:t>- Danh sách file New/Modified ở trên được tổng hợp theo trạng thái Git working tree tại thời điểm cập nhật báo cáo này.</w:t>
       </w:r>
     </w:p>
     <w:sectPr>
@@ -1476,6 +1747,10 @@
     <w:name w:val="Normal"/>
     <w:qFormat/>
     <w:rsid w:val="00FC693F"/>
+    <w:rPr>
+      <w:rFonts w:ascii="Times New Roman" w:hAnsi="Times New Roman" w:eastAsia="Times New Roman"/>
+      <w:sz w:val="24"/>
+    </w:rPr>
   </w:style>
   <w:style w:type="paragraph" w:styleId="Header">
     <w:name w:val="header"/>

</xml_diff>